<commit_message>
CV: link the Git Publish Automation project to its GitHub repo
</commit_message>
<xml_diff>
--- a/assets/Sean_Lennard_Orias_CV.docx
+++ b/assets/Sean_Lennard_Orias_CV.docx
@@ -976,8 +976,16 @@
           <w:i/>
           <w:sz w:val="20"/>
         </w:rPr>
-        <w:t xml:space="preserve">Personal Project — Bash</w:t>
-      </w:r>
+        <w:t xml:space="preserve">Personal Project — Bash — </w:t>
+      </w:r>
+      <w:hyperlink r:id="rId11">
+        <w:r>
+          <w:rPr>
+            <w:rStyle w:val="Hyperlink"/>
+          </w:rPr>
+          <w:t xml:space="preserve">Source on GitHub</w:t>
+        </w:r>
+      </w:hyperlink>
     </w:p>
     <w:p>
       <w:pPr>

</xml_diff>

<commit_message>
Update portfolio (3 files)
</commit_message>
<xml_diff>
--- a/assets/Sean_Lennard_Orias_CV.docx
+++ b/assets/Sean_Lennard_Orias_CV.docx
@@ -6,7 +6,7 @@
       <w:pPr>
         <w:pStyle w:val="Title"/>
         <w:spacing w:before="7" w:after="0"/>
-        <w:ind w:start="4"/>
+        <w:ind w:start="4" w:end="0"/>
         <w:jc w:val="center"/>
         <w:rPr/>
       </w:pPr>
@@ -30,51 +30,51 @@
           <w:rPr>
             <w:rStyle w:val="Style7"/>
           </w:rPr>
-          <w:t xml:space="preserve">seanoriasx@gmail.com</w:t>
+          <w:t>seanoriasx@gmail.com</w:t>
         </w:r>
       </w:hyperlink>
       <w:r>
         <w:rPr/>
-        <w:t xml:space="preserve">  |  </w:t>
-      </w:r>
-      <w:r>
-        <w:rPr/>
-        <w:t>Philippines</w:t>
-      </w:r>
-      <w:r>
-        <w:rPr/>
-        <w:t xml:space="preserve">  |  </w:t>
+        <w:t xml:space="preserve">  | </w:t>
+      </w:r>
+      <w:r>
+        <w:rPr/>
+        <w:t>General Trias, Cavite</w:t>
+      </w:r>
+      <w:r>
+        <w:rPr/>
+        <w:t xml:space="preserve"> |  </w:t>
       </w:r>
       <w:hyperlink r:id="rId3">
         <w:r>
           <w:rPr>
             <w:rStyle w:val="Hyperlink"/>
           </w:rPr>
-          <w:t xml:space="preserve">Portfolio</w:t>
+          <w:t>Portfolio</w:t>
         </w:r>
       </w:hyperlink>
       <w:r>
         <w:rPr/>
         <w:t xml:space="preserve">  |  </w:t>
       </w:r>
-      <w:hyperlink r:id="rId8">
+      <w:hyperlink r:id="rId4">
         <w:r>
           <w:rPr>
             <w:rStyle w:val="Hyperlink"/>
           </w:rPr>
-          <w:t xml:space="preserve">LinkedIn</w:t>
+          <w:t>LinkedIn</w:t>
         </w:r>
       </w:hyperlink>
       <w:r>
         <w:rPr/>
         <w:t xml:space="preserve">  |  </w:t>
       </w:r>
-      <w:hyperlink r:id="rId9">
+      <w:hyperlink r:id="rId5">
         <w:r>
           <w:rPr>
             <w:rStyle w:val="Hyperlink"/>
           </w:rPr>
-          <w:t xml:space="preserve">GitHub</w:t>
+          <w:t>GitHub</w:t>
         </w:r>
       </w:hyperlink>
     </w:p>
@@ -101,7 +101,7 @@
         <mc:AlternateContent>
           <mc:Choice Requires="wps">
             <w:drawing>
-              <wp:anchor distT="0" distB="0" distL="0" distR="0" simplePos="0" relativeHeight="5" behindDoc="1" locked="0" layoutInCell="0" allowOverlap="1">
+              <wp:anchor distT="0" distB="635" distL="0" distR="0" simplePos="0" relativeHeight="4" behindDoc="1" locked="0" layoutInCell="0" allowOverlap="1">
                 <wp:simplePos x="0" y="0"/>
                 <wp:positionH relativeFrom="page">
                   <wp:posOffset>800100</wp:posOffset>
@@ -112,7 +112,7 @@
                 <wp:extent cx="6171565" cy="1270"/>
                 <wp:effectExtent l="0" t="5080" r="0" b="3810"/>
                 <wp:wrapTopAndBottom/>
-                <wp:docPr id="4" name="Graphic 4"/>
+                <wp:docPr id="1" name="Graphic 4"/>
                 <a:graphic xmlns:a="http://schemas.openxmlformats.org/drawingml/2006/main">
                   <a:graphicData uri="http://schemas.microsoft.com/office/word/2010/wordprocessingShape">
                     <wps:wsp>
@@ -126,9 +126,9 @@
                           <a:avLst/>
                           <a:gdLst>
                             <a:gd name="textAreaLeft" fmla="*/ 0 w 3498840"/>
-                            <a:gd name="textAreaRight" fmla="*/ 3499200 w 3498840"/>
+                            <a:gd name="textAreaRight" fmla="*/ 3499560 w 3498840"/>
                             <a:gd name="textAreaTop" fmla="*/ 0 h 720"/>
-                            <a:gd name="textAreaBottom" fmla="*/ 1080 h 720"/>
+                            <a:gd name="textAreaBottom" fmla="*/ 1440 h 720"/>
                           </a:gdLst>
                           <a:ahLst/>
                           <a:cxnLst/>
@@ -198,7 +198,7 @@
           <w:b/>
           <w:sz w:val="20"/>
         </w:rPr>
-        <w:t xml:space="preserve">StartupLab Business Center &amp; AI Consulting Agency OPC</w:t>
+        <w:t>StartupLab Business Center &amp; AI Consulting Agency OPC</w:t>
       </w:r>
       <w:r>
         <w:rPr>
@@ -211,7 +211,7 @@
           <w:i/>
           <w:sz w:val="20"/>
         </w:rPr>
-        <w:t xml:space="preserve">Server Administrator Intern</w:t>
+        <w:t>Server Administrator Intern</w:t>
       </w:r>
       <w:r>
         <w:rPr>
@@ -242,7 +242,7 @@
         <w:rPr>
           <w:sz w:val="20"/>
         </w:rPr>
-        <w:t xml:space="preserve">Moved a client’s website and business email to a new hosting provider: backed everything up, set up new mailboxes, switched the domain over, copied across email sent during the move, and checked it all worked.</w:t>
+        <w:t>Moved a client’s website and business email to a new hosting provider: backed everything up, set up new mailboxes, switched the domain over, copied across email sent during the move, and checked it all worked.</w:t>
       </w:r>
     </w:p>
     <w:p>
@@ -267,7 +267,7 @@
         <w:rPr>
           <w:sz w:val="20"/>
         </w:rPr>
-        <w:t xml:space="preserve">Kept hosting servers healthy (clearing old logs, checking disk space, monitoring uptime), supporting a 99% uptime target.</w:t>
+        <w:t>Kept hosting servers healthy (clearing old logs, checking disk space, monitoring uptime), supporting a 99% uptime target.</w:t>
       </w:r>
     </w:p>
     <w:p>
@@ -292,7 +292,7 @@
         <w:rPr>
           <w:sz w:val="20"/>
         </w:rPr>
-        <w:t xml:space="preserve">Solved client email and website problems, such as emails not being delivered, a mail server placed on a spam blocklist, and users unable to sign in to webmail, including on-site help during a server move.</w:t>
+        <w:t>Solved client email and website problems, such as emails not being delivered, a mail server placed on a spam blocklist, and users unable to sign in to webmail, including on-site help during a server move.</w:t>
       </w:r>
     </w:p>
     <w:p>
@@ -317,7 +317,7 @@
         <w:rPr>
           <w:sz w:val="20"/>
         </w:rPr>
-        <w:t xml:space="preserve">Wrote 60+ help articles for customers and staff on domains, DNS, website connection problems, business email, security and server tasks.</w:t>
+        <w:t>Wrote 60+ help articles for customers and staff on domains, DNS, website connection problems, business email, security and server tasks.</w:t>
       </w:r>
     </w:p>
     <w:p>
@@ -342,7 +342,7 @@
         <w:rPr>
           <w:sz w:val="20"/>
         </w:rPr>
-        <w:t xml:space="preserve">Set up and fixed AI chatbots on company and client websites, including their scheduled content updates.</w:t>
+        <w:t>Set up and fixed AI chatbots on company and client websites, including their scheduled content updates.</w:t>
       </w:r>
     </w:p>
     <w:p>
@@ -368,7 +368,7 @@
         <mc:AlternateContent>
           <mc:Choice Requires="wps">
             <w:drawing>
-              <wp:anchor distT="0" distB="0" distL="0" distR="0" simplePos="0" relativeHeight="6" behindDoc="1" locked="0" layoutInCell="0" allowOverlap="1">
+              <wp:anchor distT="0" distB="635" distL="0" distR="0" simplePos="0" relativeHeight="5" behindDoc="1" locked="0" layoutInCell="0" allowOverlap="1">
                 <wp:simplePos x="0" y="0"/>
                 <wp:positionH relativeFrom="page">
                   <wp:posOffset>800100</wp:posOffset>
@@ -379,7 +379,7 @@
                 <wp:extent cx="6171565" cy="1270"/>
                 <wp:effectExtent l="0" t="5080" r="0" b="3810"/>
                 <wp:wrapTopAndBottom/>
-                <wp:docPr id="5" name="Graphic 5"/>
+                <wp:docPr id="2" name="Graphic 5"/>
                 <a:graphic xmlns:a="http://schemas.openxmlformats.org/drawingml/2006/main">
                   <a:graphicData uri="http://schemas.microsoft.com/office/word/2010/wordprocessingShape">
                     <wps:wsp>
@@ -393,9 +393,9 @@
                           <a:avLst/>
                           <a:gdLst>
                             <a:gd name="textAreaLeft" fmla="*/ 0 w 3498840"/>
-                            <a:gd name="textAreaRight" fmla="*/ 3499200 w 3498840"/>
+                            <a:gd name="textAreaRight" fmla="*/ 3499560 w 3498840"/>
                             <a:gd name="textAreaTop" fmla="*/ 0 h 720"/>
-                            <a:gd name="textAreaBottom" fmla="*/ 1080 h 720"/>
+                            <a:gd name="textAreaBottom" fmla="*/ 1440 h 720"/>
                           </a:gdLst>
                           <a:ahLst/>
                           <a:cxnLst/>
@@ -470,13 +470,7 @@
           <w:b/>
           <w:sz w:val="20"/>
         </w:rPr>
-        <w:t xml:space="preserve">Windows Active Directory Homelab</w:t>
-      </w:r>
-      <w:r>
-        <w:rPr>
-          <w:b/>
-          <w:sz w:val="20"/>
-        </w:rPr>
+        <w:t>Windows Active Directory Homelab</w:t>
         <w:tab/>
       </w:r>
       <w:r>
@@ -486,12 +480,12 @@
         </w:rPr>
         <w:t xml:space="preserve">Personal Project — </w:t>
       </w:r>
-      <w:hyperlink r:id="rId12">
+      <w:hyperlink r:id="rId6">
         <w:r>
           <w:rPr>
             <w:rStyle w:val="Hyperlink"/>
           </w:rPr>
-          <w:t xml:space="preserve">Source on GitHub</w:t>
+          <w:t>Source on GitHub</w:t>
         </w:r>
       </w:hyperlink>
     </w:p>
@@ -517,7 +511,7 @@
         <w:rPr>
           <w:sz w:val="20"/>
         </w:rPr>
-        <w:t xml:space="preserve">Built a practice IT network for a fictional 20-person company using Windows Server 2025 and Windows 11.</w:t>
+        <w:t>Built a practice IT network for a fictional 20-person company using Windows Server 2025 and Windows 11.</w:t>
       </w:r>
     </w:p>
     <w:p>
@@ -542,7 +536,7 @@
         <w:rPr>
           <w:sz w:val="20"/>
         </w:rPr>
-        <w:t xml:space="preserve">Set up accounts for 6 departments, shared folders that only each department can open, and 5 company-wide policies, including password and lockout rules, automatic screen lock and a USB block for Sales.</w:t>
+        <w:t>Set up accounts for 6 departments, shared folders that only each department can open, and 5 company-wide policies, including password and lockout rules, automatic screen lock and a USB block for Sales.</w:t>
       </w:r>
     </w:p>
     <w:p>
@@ -567,7 +561,7 @@
         <w:rPr>
           <w:sz w:val="20"/>
         </w:rPr>
-        <w:t xml:space="preserve">Worked through 6 help desk tickets (locked accounts, password resets, new starters, leavers) and wrote PowerShell scripts that automate setting up and removing user accounts.</w:t>
+        <w:t>Worked through 6 help desk tickets (locked accounts, password resets, new starters, leavers) and wrote PowerShell scripts that automate setting up and removing user accounts.</w:t>
       </w:r>
     </w:p>
     <w:p>
@@ -592,7 +586,7 @@
         <w:rPr>
           <w:sz w:val="20"/>
         </w:rPr>
-        <w:t xml:space="preserve">Found and fixed a security gap that let the help desk account reset an administrator’s password.</w:t>
+        <w:t>Found and fixed a security gap that let the help desk account reset an administrator’s password.</w:t>
       </w:r>
     </w:p>
     <w:p>
@@ -615,13 +609,7 @@
           <w:b/>
           <w:sz w:val="20"/>
         </w:rPr>
-        <w:t xml:space="preserve">Twitch Emote No-Restart</w:t>
-      </w:r>
-      <w:r>
-        <w:rPr>
-          <w:b/>
-          <w:sz w:val="20"/>
-        </w:rPr>
+        <w:t>Twitch Emote No-Restart</w:t>
         <w:tab/>
       </w:r>
       <w:r>
@@ -631,12 +619,12 @@
         </w:rPr>
         <w:t xml:space="preserve">Personal Project — </w:t>
       </w:r>
-      <w:hyperlink r:id="rId10">
+      <w:hyperlink r:id="rId7">
         <w:r>
           <w:rPr>
             <w:rStyle w:val="Hyperlink"/>
           </w:rPr>
-          <w:t xml:space="preserve">Published on Greasy Fork</w:t>
+          <w:t>Published on Greasy Fork</w:t>
         </w:r>
       </w:hyperlink>
     </w:p>
@@ -662,7 +650,7 @@
         <w:rPr>
           <w:sz w:val="20"/>
         </w:rPr>
-        <w:t xml:space="preserve">Browser add-on that stops animated emotes in Twitch chat from restarting every time the chat updates. 1,927 lines of JavaScript with no outside libraries, published and open source.</w:t>
+        <w:t>Browser add-on that stops animated emotes in Twitch chat from restarting every time the chat updates. 1,927 lines of JavaScript with no outside libraries, published and open source.</w:t>
       </w:r>
     </w:p>
     <w:p>
@@ -687,7 +675,7 @@
         <w:rPr>
           <w:sz w:val="20"/>
         </w:rPr>
-        <w:t xml:space="preserve">Measured and fixed its performance, cutting about 7,900 slow page checks per second to zero and another 6,700 per second to a few hundred.</w:t>
+        <w:t>Measured and fixed its performance, cutting about 7,900 slow page checks per second to zero and another 6,700 per second to a few hundred.</w:t>
       </w:r>
     </w:p>
     <w:p>
@@ -710,13 +698,7 @@
           <w:b/>
           <w:sz w:val="20"/>
         </w:rPr>
-        <w:t xml:space="preserve">Git Publish Automation</w:t>
-      </w:r>
-      <w:r>
-        <w:rPr>
-          <w:b/>
-          <w:sz w:val="20"/>
-        </w:rPr>
+        <w:t>Git Publish Automation</w:t>
         <w:tab/>
       </w:r>
       <w:r>
@@ -726,12 +708,12 @@
         </w:rPr>
         <w:t xml:space="preserve">Personal Project — </w:t>
       </w:r>
-      <w:hyperlink r:id="rId11">
+      <w:hyperlink r:id="rId8">
         <w:r>
           <w:rPr>
             <w:rStyle w:val="Hyperlink"/>
           </w:rPr>
-          <w:t xml:space="preserve">Source on GitHub</w:t>
+          <w:t>Source on GitHub</w:t>
         </w:r>
       </w:hyperlink>
     </w:p>
@@ -757,7 +739,7 @@
         <w:rPr>
           <w:sz w:val="20"/>
         </w:rPr>
-        <w:t xml:space="preserve">One-command script that uploads code changes to GitHub, with safety checks and a preview mode.</w:t>
+        <w:t>One-command script that uploads code changes to GitHub, with safety checks and a preview mode.</w:t>
       </w:r>
     </w:p>
     <w:p>
@@ -780,13 +762,7 @@
           <w:b/>
           <w:sz w:val="20"/>
         </w:rPr>
-        <w:t xml:space="preserve">Disaster Preparedness Game</w:t>
-      </w:r>
-      <w:r>
-        <w:rPr>
-          <w:b/>
-          <w:sz w:val="20"/>
-        </w:rPr>
+        <w:t>Disaster Preparedness Game</w:t>
         <w:tab/>
       </w:r>
       <w:r>
@@ -794,7 +770,7 @@
           <w:i/>
           <w:sz w:val="20"/>
         </w:rPr>
-        <w:t xml:space="preserve">Team Capstone Project — Programmer</w:t>
+        <w:t>Team Capstone Project — Programmer</w:t>
       </w:r>
     </w:p>
     <w:p>
@@ -819,7 +795,7 @@
         <w:rPr>
           <w:sz w:val="20"/>
         </w:rPr>
-        <w:t xml:space="preserve">Programmed an educational game about disaster readiness in Unity (C#), including the game rules, player controls and an in-game mini-map.</w:t>
+        <w:t>Programmed an educational game about disaster readiness in Unity (C#), including the game rules, player controls and an in-game mini-map.</w:t>
       </w:r>
     </w:p>
     <w:p>
@@ -845,7 +821,7 @@
         <mc:AlternateContent>
           <mc:Choice Requires="wps">
             <w:drawing>
-              <wp:anchor distT="0" distB="0" distL="0" distR="0" simplePos="0" relativeHeight="4" behindDoc="1" locked="0" layoutInCell="0" allowOverlap="1">
+              <wp:anchor distT="0" distB="635" distL="0" distR="0" simplePos="0" relativeHeight="3" behindDoc="1" locked="0" layoutInCell="0" allowOverlap="1">
                 <wp:simplePos x="0" y="0"/>
                 <wp:positionH relativeFrom="page">
                   <wp:posOffset>800100</wp:posOffset>
@@ -870,9 +846,9 @@
                           <a:avLst/>
                           <a:gdLst>
                             <a:gd name="textAreaLeft" fmla="*/ 0 w 3498840"/>
-                            <a:gd name="textAreaRight" fmla="*/ 3499200 w 3498840"/>
+                            <a:gd name="textAreaRight" fmla="*/ 3499560 w 3498840"/>
                             <a:gd name="textAreaTop" fmla="*/ 0 h 720"/>
-                            <a:gd name="textAreaBottom" fmla="*/ 1080 h 720"/>
+                            <a:gd name="textAreaBottom" fmla="*/ 1440 h 720"/>
                           </a:gdLst>
                           <a:ahLst/>
                           <a:cxnLst/>
@@ -942,7 +918,7 @@
       </w:r>
       <w:r>
         <w:rPr/>
-        <w:t xml:space="preserve">Windows Server 2025, Windows 11, Active Directory users and groups, Group Policy, DNS, DHCP, folder permissions</w:t>
+        <w:t>Windows Server 2025, Windows 11, Active Directory users and groups, Group Policy, DNS, DHCP, folder permissions</w:t>
       </w:r>
     </w:p>
     <w:p>
@@ -960,7 +936,7 @@
       </w:r>
       <w:r>
         <w:rPr/>
-        <w:t xml:space="preserve">cPanel, WHM, CyberPanel, Hostinger, Linux command line, backups, scheduled tasks, monitoring</w:t>
+        <w:t>cPanel, WHM, CyberPanel, Hostinger, Linux command line, backups, scheduled tasks, monitoring</w:t>
       </w:r>
     </w:p>
     <w:p>
@@ -978,7 +954,7 @@
       </w:r>
       <w:r>
         <w:rPr/>
-        <w:t xml:space="preserve">Cloudflare, Domainmod, DNS records, moving live domains between servers</w:t>
+        <w:t>Cloudflare, Domainmod, DNS records, moving live domains between servers</w:t>
       </w:r>
     </w:p>
     <w:p>
@@ -996,7 +972,7 @@
       </w:r>
       <w:r>
         <w:rPr/>
-        <w:t xml:space="preserve">Email delivery problems, spam blocklists, webmail access, BeDesk ticketing, Microsoft 365, Google Workspace</w:t>
+        <w:t>Email delivery problems, spam blocklists, webmail access, BeDesk ticketing, Microsoft 365, Google Workspace</w:t>
       </w:r>
     </w:p>
     <w:p>
@@ -1014,7 +990,7 @@
       </w:r>
       <w:r>
         <w:rPr/>
-        <w:t xml:space="preserve">PowerShell, Bash, JavaScript, C# (Unity), technical writing</w:t>
+        <w:t>PowerShell, Bash, JavaScript, C# (Unity), technical writing</w:t>
       </w:r>
     </w:p>
     <w:p>
@@ -1040,7 +1016,7 @@
         <mc:AlternateContent>
           <mc:Choice Requires="wps">
             <w:drawing>
-              <wp:anchor distT="0" distB="0" distL="0" distR="0" simplePos="0" relativeHeight="7" behindDoc="1" locked="0" layoutInCell="0" allowOverlap="1">
+              <wp:anchor distT="0" distB="635" distL="0" distR="0" simplePos="0" relativeHeight="6" behindDoc="1" locked="0" layoutInCell="0" allowOverlap="1">
                 <wp:simplePos x="0" y="0"/>
                 <wp:positionH relativeFrom="page">
                   <wp:posOffset>800100</wp:posOffset>
@@ -1051,7 +1027,7 @@
                 <wp:extent cx="6171565" cy="1270"/>
                 <wp:effectExtent l="0" t="5080" r="0" b="3810"/>
                 <wp:wrapTopAndBottom/>
-                <wp:docPr id="6" name="Graphic 6"/>
+                <wp:docPr id="4" name="Graphic 6"/>
                 <a:graphic xmlns:a="http://schemas.openxmlformats.org/drawingml/2006/main">
                   <a:graphicData uri="http://schemas.microsoft.com/office/word/2010/wordprocessingShape">
                     <wps:wsp>
@@ -1065,9 +1041,9 @@
                           <a:avLst/>
                           <a:gdLst>
                             <a:gd name="textAreaLeft" fmla="*/ 0 w 3498840"/>
-                            <a:gd name="textAreaRight" fmla="*/ 3499200 w 3498840"/>
+                            <a:gd name="textAreaRight" fmla="*/ 3499560 w 3498840"/>
                             <a:gd name="textAreaTop" fmla="*/ 0 h 720"/>
-                            <a:gd name="textAreaBottom" fmla="*/ 1080 h 720"/>
+                            <a:gd name="textAreaBottom" fmla="*/ 1440 h 720"/>
                           </a:gdLst>
                           <a:ahLst/>
                           <a:cxnLst/>
@@ -1132,7 +1108,7 @@
       </w:pPr>
       <w:r>
         <w:rPr/>
-        <w:t xml:space="preserve">Certified Cloud System Analyst [CCSA] (2026)  ·  Google AI Essentials, Coursera (2026)  ·  Google Cybersecurity Certificate, Coursera (2026)  ·  IT Specialist — Databases, Certiport (2024)  ·  SAP Business One, SAP (2023)</w:t>
+        <w:t>Certified Cloud System Analyst [CCSA] (2026)  ·  Google AI Essentials, Coursera (2026)  ·  Google Cybersecurity Certificate, Coursera (2026)  ·  IT Specialist — Databases, Certiport (2024)  ·  SAP Business One, SAP (2023)</w:t>
       </w:r>
     </w:p>
     <w:p>
@@ -1158,7 +1134,7 @@
         <mc:AlternateContent>
           <mc:Choice Requires="wps">
             <w:drawing>
-              <wp:anchor distT="0" distB="0" distL="0" distR="0" simplePos="0" relativeHeight="3" behindDoc="1" locked="0" layoutInCell="0" allowOverlap="1">
+              <wp:anchor distT="0" distB="635" distL="0" distR="0" simplePos="0" relativeHeight="2" behindDoc="1" locked="0" layoutInCell="0" allowOverlap="1">
                 <wp:simplePos x="0" y="0"/>
                 <wp:positionH relativeFrom="page">
                   <wp:posOffset>800100</wp:posOffset>
@@ -1169,7 +1145,7 @@
                 <wp:extent cx="6171565" cy="1270"/>
                 <wp:effectExtent l="0" t="5080" r="0" b="3810"/>
                 <wp:wrapTopAndBottom/>
-                <wp:docPr id="2" name="Graphic 2"/>
+                <wp:docPr id="5" name="Graphic 2"/>
                 <a:graphic xmlns:a="http://schemas.openxmlformats.org/drawingml/2006/main">
                   <a:graphicData uri="http://schemas.microsoft.com/office/word/2010/wordprocessingShape">
                     <wps:wsp>
@@ -1183,9 +1159,9 @@
                           <a:avLst/>
                           <a:gdLst>
                             <a:gd name="textAreaLeft" fmla="*/ 0 w 3498840"/>
-                            <a:gd name="textAreaRight" fmla="*/ 3499200 w 3498840"/>
+                            <a:gd name="textAreaRight" fmla="*/ 3499560 w 3498840"/>
                             <a:gd name="textAreaTop" fmla="*/ 0 h 720"/>
-                            <a:gd name="textAreaBottom" fmla="*/ 1080 h 720"/>
+                            <a:gd name="textAreaBottom" fmla="*/ 1440 h 720"/>
                           </a:gdLst>
                           <a:ahLst/>
                           <a:cxnLst/>
@@ -1259,7 +1235,7 @@
       </w:pPr>
       <w:r>
         <w:rPr/>
-        <w:t xml:space="preserve">Bachelor of Science in Information Technology</w:t>
+        <w:t>Bachelor of Science in Information Technology</w:t>
       </w:r>
     </w:p>
     <w:sectPr>
@@ -1581,6 +1557,7 @@
     <w:qFormat/>
     <w:pPr>
       <w:widowControl w:val="false"/>
+      <w:suppressAutoHyphens w:val="true"/>
       <w:bidi w:val="0"/>
       <w:spacing w:lineRule="auto" w:line="240" w:before="0" w:after="0"/>
       <w:ind w:start="0" w:end="0"/>

</xml_diff>

<commit_message>
Reword internship bullets on CV; drop outdated Studying now row; untrack Word lock file
</commit_message>
<xml_diff>
--- a/assets/Sean_Lennard_Orias_CV.docx
+++ b/assets/Sean_Lennard_Orias_CV.docx
@@ -268,7 +268,7 @@
         <w:rPr>
           <w:sz w:val="20"/>
         </w:rPr>
-        <w:t>Moved a client’s website and business email to a new hosting provider: backed everything up, set up new mailboxes, switched the domain over, copied across email sent during the move, and checked it all worked.</w:t>
+        <w:t>Migrated a client’s website and business email from WHM/cPanel to Hostinger/CyberPanel: backups, mailbox provisioning, DNS cutover, delta mail sync and post-cutover validation.</w:t>
       </w:r>
     </w:p>
     <w:p>
@@ -293,15 +293,9 @@
         <w:rPr>
           <w:sz w:val="20"/>
         </w:rPr>
-        <w:t>Kept</w:t>
+        <w:t>Troubleshot email delivery failures, a Spamhaus-listed mail server and webmail sign-in issues; provided on-site support during the server cutover.</w:t>
       </w:r>
       <w:proofErr w:type="gramEnd"/>
-      <w:r>
-        <w:rPr>
-          <w:sz w:val="20"/>
-        </w:rPr>
-        <w:t xml:space="preserve"> hosting servers healthy (clearing old logs, checking disk space, monitoring uptime), supporting a 99% uptime target.</w:t>
-      </w:r>
     </w:p>
     <w:p>
       <w:pPr>
@@ -324,7 +318,7 @@
         <w:rPr>
           <w:sz w:val="20"/>
         </w:rPr>
-        <w:t>Solved client email and website problems, such as emails not being delivered, a mail server placed on a spam blocklist, and users unable to sign in to webmail, including on-site help during a server move.</w:t>
+        <w:t>Administered hosting via WHM, cPanel, Cloudflare and Domainmod; performed log cleanup, disk-usage audits and uptime monitoring from the Linux CLI.</w:t>
       </w:r>
     </w:p>
     <w:p>
@@ -348,7 +342,7 @@
         <w:rPr>
           <w:sz w:val="20"/>
         </w:rPr>
-        <w:t>Wrote 60+ help articles for customers and staff on domains, DNS, website connection problems, business email, security and server tasks.</w:t>
+        <w:t>Authored 60+ help-center and internal KB articles on DNS, domains, business email, website connectivity, security and server operations.</w:t>
       </w:r>
     </w:p>
     <w:p>
@@ -372,7 +366,7 @@
         <w:rPr>
           <w:sz w:val="20"/>
         </w:rPr>
-        <w:t>Set up and fixed AI chatbots on company and client websites, including their scheduled content updates.</w:t>
+        <w:t>Deployed and troubleshot AI chatbots on company and client websites, including cron-scheduled content ingestion and backend integrations.</w:t>
       </w:r>
     </w:p>
     <w:p>

</xml_diff>

<commit_message>
CV: add summary; drop Twitch and Git Publish projects from CV
</commit_message>
<xml_diff>
--- a/assets/Sean_Lennard_Orias_CV.docx
+++ b/assets/Sean_Lennard_Orias_CV.docx
@@ -67,6 +67,124 @@
           <w:sz w:val="10"/>
         </w:rPr>
       </w:pPr>
+    </w:p>
+    <w:p>
+      <w:pPr>
+        <w:pStyle w:val="Heading1"/>
+        <w:rPr/>
+      </w:pPr>
+      <w:r>
+        <mc:AlternateContent>
+          <mc:Choice Requires="wps">
+            <w:drawing>
+              <wp:anchor distT="0" distB="0" distL="0" distR="0" simplePos="0" relativeHeight="2" behindDoc="1" locked="0" layoutInCell="0" allowOverlap="1">
+                <wp:simplePos x="0" y="0"/>
+                <wp:positionH relativeFrom="page">
+                  <wp:posOffset>800100</wp:posOffset>
+                </wp:positionH>
+                <wp:positionV relativeFrom="paragraph">
+                  <wp:posOffset>200660</wp:posOffset>
+                </wp:positionV>
+                <wp:extent cx="6171565" cy="1270"/>
+                <wp:effectExtent l="0" t="5080" r="0" b="3810"/>
+                <wp:wrapTopAndBottom/>
+                <wp:docPr id="1" name="Graphic 1"/>
+                <a:graphic xmlns:a="http://schemas.openxmlformats.org/drawingml/2006/main">
+                  <a:graphicData uri="http://schemas.microsoft.com/office/word/2010/wordprocessingShape">
+                    <wps:wsp>
+                      <wps:cNvSpPr/>
+                      <wps:spPr>
+                        <a:xfrm>
+                          <a:off x="0" y="0"/>
+                          <a:ext cx="6171480" cy="1440"/>
+                        </a:xfrm>
+                        <a:custGeom>
+                          <a:avLst/>
+                          <a:gdLst>
+                            <a:gd name="textAreaLeft" fmla="*/ 0 w 3498840"/>
+                            <a:gd name="textAreaRight" fmla="*/ 3499200 w 3498840"/>
+                            <a:gd name="textAreaTop" fmla="*/ 0 h 720"/>
+                            <a:gd name="textAreaBottom" fmla="*/ 1080 h 720"/>
+                          </a:gdLst>
+                          <a:ahLst/>
+                          <a:cxnLst/>
+                          <a:rect l="textAreaLeft" t="textAreaTop" r="textAreaRight" b="textAreaBottom"/>
+                          <a:pathLst>
+                            <a:path w="6171565" h="0">
+                              <a:moveTo>
+                                <a:pt x="6171565" y="0"/>
+                              </a:moveTo>
+                              <a:lnTo>
+                                <a:pt x="0" y="0"/>
+                              </a:lnTo>
+                            </a:path>
+                            <a:path w="6171565" h="0">
+                              <a:moveTo>
+                                <a:pt x="6171565" y="0"/>
+                              </a:moveTo>
+                              <a:lnTo>
+                                <a:pt x="0" y="0"/>
+                              </a:lnTo>
+                            </a:path>
+                          </a:pathLst>
+                        </a:custGeom>
+                        <a:noFill/>
+                        <a:ln w="9525">
+                          <a:solidFill>
+                            <a:srgbClr val="2D2D2D"/>
+                          </a:solidFill>
+                          <a:round/>
+                        </a:ln>
+                      </wps:spPr>
+                      <wps:style>
+                        <a:lnRef idx="0"/>
+                        <a:fillRef idx="0"/>
+                        <a:effectRef idx="0"/>
+                        <a:fontRef idx="minor"/>
+                      </wps:style>
+                      <wps:bodyPr/>
+                    </wps:wsp>
+                  </a:graphicData>
+                </a:graphic>
+              </wp:anchor>
+            </w:drawing>
+          </mc:Choice>
+          <mc:Fallback>
+            <w:pict/>
+          </mc:Fallback>
+        </mc:AlternateContent>
+      </w:r>
+      <w:r>
+        <w:rPr/>
+        <w:t>SUMMARY</w:t>
+      </w:r>
+    </w:p>
+    <w:p>
+      <w:pPr>
+        <w:pStyle w:val="BodyText"/>
+        <w:spacing w:before="90" w:after="0"/>
+        <w:ind w:start="182" w:end="0"/>
+        <w:jc w:val="both"/>
+        <w:rPr/>
+      </w:pPr>
+      <w:r>
+        <w:rPr/>
+        <w:t xml:space="preserve">IT support and systems intern experienced in troubleshooting email delivery, webmail access and hosting issues, migrating a client’s website and business email, and writing 60+ help-center and KB articles. Built a Windows Server 2025 / Active Directory homelab covering user management, Group Policy and help desk tickets.</w:t>
+      </w:r>
+    </w:p>
+    <w:p>
+      <w:pPr>
+        <w:pStyle w:val="BodyText"/>
+        <w:spacing w:before="20" w:after="0"/>
+        <w:rPr>
+          <w:sz w:val="10"/>
+        </w:rPr>
+      </w:pPr>
+      <w:r>
+        <w:rPr>
+          <w:sz w:val="10"/>
+        </w:rPr>
+      </w:r>
     </w:p>
     <w:p>
       <w:pPr>
@@ -627,162 +745,6 @@
           <w:sz w:val="20"/>
         </w:rPr>
         <w:t>Found and fixed a security gap that let the help desk account reset an administrator’s password.</w:t>
-      </w:r>
-    </w:p>
-    <w:p>
-      <w:pPr>
-        <w:tabs>
-          <w:tab w:val="left" w:pos="3900"/>
-        </w:tabs>
-        <w:spacing w:before="90"/>
-        <w:ind w:left="182"/>
-        <w:rPr>
-          <w:i/>
-          <w:sz w:val="20"/>
-        </w:rPr>
-      </w:pPr>
-      <w:r>
-        <w:rPr>
-          <w:b/>
-          <w:sz w:val="20"/>
-        </w:rPr>
-        <w:t>Twitch Emote No-Restart</w:t>
-      </w:r>
-      <w:r>
-        <w:rPr>
-          <w:b/>
-          <w:sz w:val="20"/>
-        </w:rPr>
-        <w:tab/>
-      </w:r>
-      <w:r>
-        <w:rPr>
-          <w:i/>
-          <w:sz w:val="20"/>
-        </w:rPr>
-        <w:t xml:space="preserve">Personal Project — </w:t>
-      </w:r>
-      <w:hyperlink r:id="rId10">
-        <w:r>
-          <w:rPr>
-            <w:rStyle w:val="Hyperlink"/>
-          </w:rPr>
-          <w:t>Published on Greasy Fork</w:t>
-        </w:r>
-      </w:hyperlink>
-    </w:p>
-    <w:p>
-      <w:pPr>
-        <w:pStyle w:val="ListParagraph"/>
-        <w:numPr>
-          <w:ilvl w:val="0"/>
-          <w:numId w:val="1"/>
-        </w:numPr>
-        <w:tabs>
-          <w:tab w:val="left" w:pos="662"/>
-        </w:tabs>
-        <w:spacing w:before="80"/>
-        <w:ind w:right="213"/>
-        <w:jc w:val="both"/>
-        <w:rPr>
-          <w:sz w:val="20"/>
-        </w:rPr>
-      </w:pPr>
-      <w:r>
-        <w:rPr>
-          <w:sz w:val="20"/>
-        </w:rPr>
-        <w:t>Browser add-on that stops animated emotes in Twitch chat from restarting every time the chat updates. 1,927 lines of JavaScript with no outside libraries, published and open source.</w:t>
-      </w:r>
-    </w:p>
-    <w:p>
-      <w:pPr>
-        <w:pStyle w:val="ListParagraph"/>
-        <w:numPr>
-          <w:ilvl w:val="0"/>
-          <w:numId w:val="1"/>
-        </w:numPr>
-        <w:tabs>
-          <w:tab w:val="left" w:pos="662"/>
-        </w:tabs>
-        <w:spacing w:before="80"/>
-        <w:ind w:right="213"/>
-        <w:jc w:val="both"/>
-        <w:rPr>
-          <w:sz w:val="20"/>
-        </w:rPr>
-      </w:pPr>
-      <w:r>
-        <w:rPr>
-          <w:sz w:val="20"/>
-        </w:rPr>
-        <w:t>Measured and fixed its performance, cutting about 7,900 slow page checks per second to zero and another 6,700 per second to a few hundred.</w:t>
-      </w:r>
-    </w:p>
-    <w:p>
-      <w:pPr>
-        <w:tabs>
-          <w:tab w:val="left" w:pos="3900"/>
-        </w:tabs>
-        <w:spacing w:before="90"/>
-        <w:ind w:left="182"/>
-        <w:rPr>
-          <w:i/>
-          <w:sz w:val="20"/>
-        </w:rPr>
-      </w:pPr>
-      <w:r>
-        <w:rPr>
-          <w:b/>
-          <w:sz w:val="20"/>
-        </w:rPr>
-        <w:t>Git Publish Automation</w:t>
-      </w:r>
-      <w:r>
-        <w:rPr>
-          <w:b/>
-          <w:sz w:val="20"/>
-        </w:rPr>
-        <w:tab/>
-      </w:r>
-      <w:r>
-        <w:rPr>
-          <w:i/>
-          <w:sz w:val="20"/>
-        </w:rPr>
-        <w:t xml:space="preserve">Personal Project — </w:t>
-      </w:r>
-      <w:hyperlink r:id="rId11">
-        <w:r>
-          <w:rPr>
-            <w:rStyle w:val="Hyperlink"/>
-          </w:rPr>
-          <w:t>Source on GitHub</w:t>
-        </w:r>
-      </w:hyperlink>
-    </w:p>
-    <w:p>
-      <w:pPr>
-        <w:pStyle w:val="ListParagraph"/>
-        <w:numPr>
-          <w:ilvl w:val="0"/>
-          <w:numId w:val="1"/>
-        </w:numPr>
-        <w:tabs>
-          <w:tab w:val="left" w:pos="662"/>
-        </w:tabs>
-        <w:spacing w:before="80"/>
-        <w:ind w:right="213"/>
-        <w:jc w:val="both"/>
-        <w:rPr>
-          <w:sz w:val="20"/>
-        </w:rPr>
-      </w:pPr>
-      <w:r>
-        <w:rPr>
-          <w:sz w:val="20"/>
-        </w:rPr>
-        <w:t>One-command script that uploads code changes to GitHub, with safety checks and a preview mode.</w:t>
       </w:r>
     </w:p>
     <w:p>

</xml_diff>

<commit_message>
CV: ATS fixes - visible URLs, title-first experience line with month dates, one certification per line, graduate summary
</commit_message>
<xml_diff>
--- a/assets/Sean_Lennard_Orias_CV.docx
+++ b/assets/Sean_Lennard_Orias_CV.docx
@@ -26,14 +26,17 @@
         </w:r>
       </w:hyperlink>
       <w:r>
-        <w:t xml:space="preserve">  | General Trias, Cavite |  </w:t>
+        <w:t xml:space="preserve">  | General Trias, Cavite</w:t>
+      </w:r>
+      <w:r>
+        <w:br/>
       </w:r>
       <w:hyperlink r:id="rId6">
         <w:r>
           <w:rPr>
             <w:rStyle w:val="Hyperlink"/>
           </w:rPr>
-          <w:t>Portfolio</w:t>
+          <w:t>deadnme.github.io/portfolio</w:t>
         </w:r>
       </w:hyperlink>
       <w:r>
@@ -44,7 +47,7 @@
           <w:rPr>
             <w:rStyle w:val="Hyperlink"/>
           </w:rPr>
-          <w:t>LinkedIn</w:t>
+          <w:t>linkedin.com/in/sean-orias-67763924a</w:t>
         </w:r>
       </w:hyperlink>
       <w:r>
@@ -55,7 +58,7 @@
           <w:rPr>
             <w:rStyle w:val="Hyperlink"/>
           </w:rPr>
-          <w:t>GitHub</w:t>
+          <w:t>github.com/deadnme</w:t>
         </w:r>
       </w:hyperlink>
     </w:p>
@@ -169,7 +172,7 @@
       </w:pPr>
       <w:r>
         <w:rPr/>
-        <w:t xml:space="preserve">IT support and systems intern experienced in troubleshooting email delivery, webmail access and hosting issues, migrating a client’s website and business email, and writing 60+ help-center and KB articles. Built a Windows Server 2025 / Active Directory homelab covering user management, Group Policy and help desk tickets.</w:t>
+        <w:t xml:space="preserve">IT graduate with internship experience troubleshooting email delivery, webmail access and hosting issues, migrating a client’s website and business email, and writing 60+ help-center and KB articles. Built a Windows Server 2025 / Active Directory homelab covering user management, Group Policy and help desk tickets.</w:t>
       </w:r>
     </w:p>
     <w:p>
@@ -299,70 +302,18 @@
           <w:sz w:val="20"/>
         </w:rPr>
       </w:pPr>
-      <w:proofErr w:type="spellStart"/>
       <w:r>
         <w:rPr>
           <w:b/>
           <w:sz w:val="20"/>
         </w:rPr>
-        <w:t>StartupLab</w:t>
-      </w:r>
-      <w:proofErr w:type="spellEnd"/>
-      <w:r>
-        <w:rPr>
-          <w:b/>
-          <w:sz w:val="20"/>
-        </w:rPr>
-        <w:t xml:space="preserve"> Business Center &amp; AI Consulting Agency </w:t>
-      </w:r>
-      <w:proofErr w:type="gramStart"/>
-      <w:r>
-        <w:rPr>
-          <w:b/>
-          <w:sz w:val="20"/>
-        </w:rPr>
-        <w:t>OPC</w:t>
-      </w:r>
-      <w:r>
-        <w:rPr>
-          <w:sz w:val="20"/>
-        </w:rPr>
-        <w:t xml:space="preserve">  |</w:t>
-      </w:r>
-      <w:proofErr w:type="gramEnd"/>
-      <w:r>
-        <w:rPr>
-          <w:sz w:val="20"/>
-        </w:rPr>
-        <w:t xml:space="preserve">  </w:t>
-      </w:r>
-      <w:r>
-        <w:rPr>
-          <w:i/>
-          <w:sz w:val="20"/>
-        </w:rPr>
-        <w:t xml:space="preserve">Server Administrator </w:t>
-      </w:r>
-      <w:proofErr w:type="gramStart"/>
-      <w:r>
-        <w:rPr>
-          <w:i/>
-          <w:sz w:val="20"/>
-        </w:rPr>
-        <w:t>Intern</w:t>
-      </w:r>
-      <w:r>
-        <w:rPr>
-          <w:sz w:val="20"/>
-        </w:rPr>
-        <w:t xml:space="preserve">  (</w:t>
-      </w:r>
-      <w:proofErr w:type="gramEnd"/>
-      <w:r>
-        <w:rPr>
-          <w:sz w:val="20"/>
-        </w:rPr>
-        <w:t>January 26 – April 15, 2026)</w:t>
+        <w:t xml:space="preserve">Server Administrator Intern</w:t>
+      </w:r>
+      <w:r>
+        <w:rPr>
+          <w:sz w:val="20"/>
+        </w:rPr>
+        <w:t xml:space="preserve">  |  StartupLab Business Center &amp; AI Consulting Agency OPC  |  Jan 2026 – Apr 2026</w:t>
       </w:r>
     </w:p>
     <w:p>
@@ -1143,47 +1094,51 @@
         <w:jc w:val="both"/>
       </w:pPr>
       <w:r>
-        <w:t>Certified Cloud System Analyst [CCSA] (2026</w:t>
-      </w:r>
-      <w:proofErr w:type="gramStart"/>
-      <w:r>
-        <w:t>)  ·</w:t>
-      </w:r>
-      <w:proofErr w:type="gramEnd"/>
-      <w:r>
-        <w:t xml:space="preserve">  Google AI Essentials, Coursera (2026</w:t>
-      </w:r>
-      <w:proofErr w:type="gramStart"/>
-      <w:r>
-        <w:t>)  ·</w:t>
-      </w:r>
-      <w:proofErr w:type="gramEnd"/>
-      <w:r>
-        <w:t xml:space="preserve">  Google Cybersecurity Certificate, Coursera (2026</w:t>
-      </w:r>
-      <w:proofErr w:type="gramStart"/>
-      <w:r>
-        <w:t>)  ·</w:t>
-      </w:r>
-      <w:proofErr w:type="gramEnd"/>
-      <w:r>
-        <w:t xml:space="preserve">  IT Specialist — Databases, </w:t>
-      </w:r>
-      <w:proofErr w:type="spellStart"/>
-      <w:r>
-        <w:t>Certiport</w:t>
-      </w:r>
-      <w:proofErr w:type="spellEnd"/>
-      <w:r>
-        <w:t xml:space="preserve"> (2024</w:t>
-      </w:r>
-      <w:proofErr w:type="gramStart"/>
-      <w:r>
-        <w:t>)  ·</w:t>
-      </w:r>
-      <w:proofErr w:type="gramEnd"/>
-      <w:r>
-        <w:t xml:space="preserve">  SAP Business One, SAP (2023)</w:t>
+        <w:t xml:space="preserve">Certified Cloud System Analyst [CCSA] (2026)</w:t>
+      </w:r>
+    </w:p>
+    <w:p>
+      <w:pPr>
+        <w:pStyle w:val="BodyText"/>
+        <w:spacing w:before="20"/>
+        <w:ind w:left="182"/>
+        <w:jc w:val="both"/>
+      </w:pPr>
+      <w:r>
+        <w:t xml:space="preserve">Google AI Essentials, Coursera (2026)</w:t>
+      </w:r>
+    </w:p>
+    <w:p>
+      <w:pPr>
+        <w:pStyle w:val="BodyText"/>
+        <w:spacing w:before="20"/>
+        <w:ind w:left="182"/>
+        <w:jc w:val="both"/>
+      </w:pPr>
+      <w:r>
+        <w:t xml:space="preserve">Google Cybersecurity Certificate, Coursera (2026)</w:t>
+      </w:r>
+    </w:p>
+    <w:p>
+      <w:pPr>
+        <w:pStyle w:val="BodyText"/>
+        <w:spacing w:before="20"/>
+        <w:ind w:left="182"/>
+        <w:jc w:val="both"/>
+      </w:pPr>
+      <w:r>
+        <w:t xml:space="preserve">IT Specialist – Databases, Certiport (2024)</w:t>
+      </w:r>
+    </w:p>
+    <w:p>
+      <w:pPr>
+        <w:pStyle w:val="BodyText"/>
+        <w:spacing w:before="20"/>
+        <w:ind w:left="182"/>
+        <w:jc w:val="both"/>
+      </w:pPr>
+      <w:r>
+        <w:t xml:space="preserve">SAP Business One, SAP (2023)</w:t>
       </w:r>
     </w:p>
     <w:p>

</xml_diff>

<commit_message>
CV: left-align paragraphs instead of justified
</commit_message>
<xml_diff>
--- a/assets/Sean_Lennard_Orias_CV.docx
+++ b/assets/Sean_Lennard_Orias_CV.docx
@@ -167,7 +167,7 @@
         <w:pStyle w:val="BodyText"/>
         <w:spacing w:before="90" w:after="0"/>
         <w:ind w:start="182" w:end="0"/>
-        <w:jc w:val="both"/>
+        <w:jc w:val="left"/>
         <w:rPr/>
       </w:pPr>
       <w:r>
@@ -297,7 +297,7 @@
       <w:pPr>
         <w:spacing w:before="104"/>
         <w:ind w:left="181"/>
-        <w:jc w:val="both"/>
+        <w:jc w:val="left"/>
         <w:rPr>
           <w:sz w:val="20"/>
         </w:rPr>
@@ -328,7 +328,7 @@
         </w:tabs>
         <w:spacing w:before="80"/>
         <w:ind w:right="213"/>
-        <w:jc w:val="both"/>
+        <w:jc w:val="left"/>
         <w:rPr>
           <w:sz w:val="20"/>
         </w:rPr>
@@ -352,7 +352,7 @@
         </w:tabs>
         <w:spacing w:before="80"/>
         <w:ind w:right="213"/>
-        <w:jc w:val="both"/>
+        <w:jc w:val="left"/>
         <w:rPr>
           <w:sz w:val="20"/>
         </w:rPr>
@@ -378,7 +378,7 @@
         </w:tabs>
         <w:spacing w:before="80"/>
         <w:ind w:right="213"/>
-        <w:jc w:val="both"/>
+        <w:jc w:val="left"/>
         <w:rPr>
           <w:sz w:val="20"/>
         </w:rPr>
@@ -402,7 +402,7 @@
         </w:tabs>
         <w:spacing w:before="80"/>
         <w:ind w:right="213"/>
-        <w:jc w:val="both"/>
+        <w:jc w:val="left"/>
         <w:rPr>
           <w:sz w:val="20"/>
         </w:rPr>
@@ -426,7 +426,7 @@
         </w:tabs>
         <w:spacing w:before="80"/>
         <w:ind w:right="213"/>
-        <w:jc w:val="both"/>
+        <w:jc w:val="left"/>
         <w:rPr>
           <w:sz w:val="20"/>
         </w:rPr>
@@ -614,7 +614,7 @@
         </w:tabs>
         <w:spacing w:before="80"/>
         <w:ind w:right="213"/>
-        <w:jc w:val="both"/>
+        <w:jc w:val="left"/>
         <w:rPr>
           <w:sz w:val="20"/>
         </w:rPr>
@@ -638,7 +638,7 @@
         </w:tabs>
         <w:spacing w:before="80"/>
         <w:ind w:right="213"/>
-        <w:jc w:val="both"/>
+        <w:jc w:val="left"/>
         <w:rPr>
           <w:sz w:val="20"/>
         </w:rPr>
@@ -662,7 +662,7 @@
         </w:tabs>
         <w:spacing w:before="80"/>
         <w:ind w:right="213"/>
-        <w:jc w:val="both"/>
+        <w:jc w:val="left"/>
         <w:rPr>
           <w:sz w:val="20"/>
         </w:rPr>
@@ -686,7 +686,7 @@
         </w:tabs>
         <w:spacing w:before="80"/>
         <w:ind w:right="213"/>
-        <w:jc w:val="both"/>
+        <w:jc w:val="left"/>
         <w:rPr>
           <w:sz w:val="20"/>
         </w:rPr>
@@ -744,7 +744,7 @@
         </w:tabs>
         <w:spacing w:before="80"/>
         <w:ind w:right="213"/>
-        <w:jc w:val="both"/>
+        <w:jc w:val="left"/>
         <w:rPr>
           <w:sz w:val="20"/>
         </w:rPr>
@@ -1091,7 +1091,7 @@
         <w:pStyle w:val="BodyText"/>
         <w:spacing w:before="90"/>
         <w:ind w:left="182"/>
-        <w:jc w:val="both"/>
+        <w:jc w:val="left"/>
       </w:pPr>
       <w:r>
         <w:t xml:space="preserve">Certified Cloud System Analyst [CCSA] (2026)</w:t>
@@ -1102,7 +1102,7 @@
         <w:pStyle w:val="BodyText"/>
         <w:spacing w:before="20"/>
         <w:ind w:left="182"/>
-        <w:jc w:val="both"/>
+        <w:jc w:val="left"/>
       </w:pPr>
       <w:r>
         <w:t xml:space="preserve">Google AI Essentials, Coursera (2026)</w:t>
@@ -1113,7 +1113,7 @@
         <w:pStyle w:val="BodyText"/>
         <w:spacing w:before="20"/>
         <w:ind w:left="182"/>
-        <w:jc w:val="both"/>
+        <w:jc w:val="left"/>
       </w:pPr>
       <w:r>
         <w:t xml:space="preserve">Google Cybersecurity Certificate, Coursera (2026)</w:t>
@@ -1124,7 +1124,7 @@
         <w:pStyle w:val="BodyText"/>
         <w:spacing w:before="20"/>
         <w:ind w:left="182"/>
-        <w:jc w:val="both"/>
+        <w:jc w:val="left"/>
       </w:pPr>
       <w:r>
         <w:t xml:space="preserve">IT Specialist – Databases, Certiport (2024)</w:t>
@@ -1135,7 +1135,7 @@
         <w:pStyle w:val="BodyText"/>
         <w:spacing w:before="20"/>
         <w:ind w:left="182"/>
-        <w:jc w:val="both"/>
+        <w:jc w:val="left"/>
       </w:pPr>
       <w:r>
         <w:t xml:space="preserve">SAP Business One, SAP (2023)</w:t>

</xml_diff>

<commit_message>
CV: export with Word, full-width dividers, tighter bullet spacing to keep one page in Word
</commit_message>
<xml_diff>
--- a/assets/Sean_Lennard_Orias_CV.docx
+++ b/assets/Sean_Lennard_Orias_CV.docx
@@ -88,7 +88,7 @@
                 <wp:positionV relativeFrom="paragraph">
                   <wp:posOffset>200660</wp:posOffset>
                 </wp:positionV>
-                <wp:extent cx="6171565" cy="1270"/>
+                <wp:extent cx="6286500" cy="1270"/>
                 <wp:effectExtent l="0" t="5080" r="0" b="3810"/>
                 <wp:wrapTopAndBottom/>
                 <wp:docPr id="1" name="Graphic 1"/>
@@ -99,7 +99,7 @@
                       <wps:spPr>
                         <a:xfrm>
                           <a:off x="0" y="0"/>
-                          <a:ext cx="6171480" cy="1440"/>
+                          <a:ext cx="6286500" cy="1440"/>
                         </a:xfrm>
                         <a:custGeom>
                           <a:avLst/>
@@ -208,7 +208,7 @@
                 <wp:positionV relativeFrom="paragraph">
                   <wp:posOffset>200660</wp:posOffset>
                 </wp:positionV>
-                <wp:extent cx="6171565" cy="1270"/>
+                <wp:extent cx="6286500" cy="1270"/>
                 <wp:effectExtent l="0" t="5080" r="0" b="3810"/>
                 <wp:wrapTopAndBottom/>
                 <wp:docPr id="1" name="Graphic 4"/>
@@ -220,7 +220,7 @@
                       <wps:spPr>
                         <a:xfrm>
                           <a:off x="0" y="0"/>
-                          <a:ext cx="6171480" cy="1440"/>
+                          <a:ext cx="6286500" cy="1440"/>
                         </a:xfrm>
                         <a:custGeom>
                           <a:avLst/>
@@ -326,7 +326,7 @@
         <w:tabs>
           <w:tab w:val="left" w:pos="662"/>
         </w:tabs>
-        <w:spacing w:before="80"/>
+        <w:spacing w:before="60"/>
         <w:ind w:right="213"/>
         <w:jc w:val="left"/>
         <w:rPr>
@@ -350,7 +350,7 @@
         <w:tabs>
           <w:tab w:val="left" w:pos="662"/>
         </w:tabs>
-        <w:spacing w:before="80"/>
+        <w:spacing w:before="60"/>
         <w:ind w:right="213"/>
         <w:jc w:val="left"/>
         <w:rPr>
@@ -376,7 +376,7 @@
         <w:tabs>
           <w:tab w:val="left" w:pos="662"/>
         </w:tabs>
-        <w:spacing w:before="80"/>
+        <w:spacing w:before="60"/>
         <w:ind w:right="213"/>
         <w:jc w:val="left"/>
         <w:rPr>
@@ -400,7 +400,7 @@
         <w:tabs>
           <w:tab w:val="left" w:pos="662"/>
         </w:tabs>
-        <w:spacing w:before="80"/>
+        <w:spacing w:before="60"/>
         <w:ind w:right="213"/>
         <w:jc w:val="left"/>
         <w:rPr>
@@ -424,7 +424,7 @@
         <w:tabs>
           <w:tab w:val="left" w:pos="662"/>
         </w:tabs>
-        <w:spacing w:before="80"/>
+        <w:spacing w:before="60"/>
         <w:ind w:right="213"/>
         <w:jc w:val="left"/>
         <w:rPr>
@@ -466,7 +466,7 @@
                 <wp:positionV relativeFrom="paragraph">
                   <wp:posOffset>200660</wp:posOffset>
                 </wp:positionV>
-                <wp:extent cx="6171565" cy="1270"/>
+                <wp:extent cx="6286500" cy="1270"/>
                 <wp:effectExtent l="0" t="5080" r="0" b="3810"/>
                 <wp:wrapTopAndBottom/>
                 <wp:docPr id="2" name="Graphic 5"/>
@@ -478,7 +478,7 @@
                       <wps:spPr>
                         <a:xfrm>
                           <a:off x="0" y="0"/>
-                          <a:ext cx="6171480" cy="1440"/>
+                          <a:ext cx="6286500" cy="1440"/>
                         </a:xfrm>
                         <a:custGeom>
                           <a:avLst/>
@@ -612,7 +612,7 @@
         <w:tabs>
           <w:tab w:val="left" w:pos="662"/>
         </w:tabs>
-        <w:spacing w:before="80"/>
+        <w:spacing w:before="60"/>
         <w:ind w:right="213"/>
         <w:jc w:val="left"/>
         <w:rPr>
@@ -636,7 +636,7 @@
         <w:tabs>
           <w:tab w:val="left" w:pos="662"/>
         </w:tabs>
-        <w:spacing w:before="80"/>
+        <w:spacing w:before="60"/>
         <w:ind w:right="213"/>
         <w:jc w:val="left"/>
         <w:rPr>
@@ -660,7 +660,7 @@
         <w:tabs>
           <w:tab w:val="left" w:pos="662"/>
         </w:tabs>
-        <w:spacing w:before="80"/>
+        <w:spacing w:before="60"/>
         <w:ind w:right="213"/>
         <w:jc w:val="left"/>
         <w:rPr>
@@ -684,7 +684,7 @@
         <w:tabs>
           <w:tab w:val="left" w:pos="662"/>
         </w:tabs>
-        <w:spacing w:before="80"/>
+        <w:spacing w:before="60"/>
         <w:ind w:right="213"/>
         <w:jc w:val="left"/>
         <w:rPr>
@@ -742,7 +742,7 @@
         <w:tabs>
           <w:tab w:val="left" w:pos="662"/>
         </w:tabs>
-        <w:spacing w:before="80"/>
+        <w:spacing w:before="60"/>
         <w:ind w:right="213"/>
         <w:jc w:val="left"/>
         <w:rPr>
@@ -784,7 +784,7 @@
                 <wp:positionV relativeFrom="paragraph">
                   <wp:posOffset>200660</wp:posOffset>
                 </wp:positionV>
-                <wp:extent cx="6171565" cy="1270"/>
+                <wp:extent cx="6286500" cy="1270"/>
                 <wp:effectExtent l="0" t="5080" r="0" b="3810"/>
                 <wp:wrapTopAndBottom/>
                 <wp:docPr id="3" name="Graphic 3"/>
@@ -796,7 +796,7 @@
                       <wps:spPr>
                         <a:xfrm>
                           <a:off x="0" y="0"/>
-                          <a:ext cx="6171480" cy="1440"/>
+                          <a:ext cx="6286500" cy="1440"/>
                         </a:xfrm>
                         <a:custGeom>
                           <a:avLst/>
@@ -888,7 +888,7 @@
     <w:p>
       <w:pPr>
         <w:pStyle w:val="BodyText"/>
-        <w:spacing w:before="90"/>
+        <w:spacing w:before="60"/>
         <w:ind w:left="182"/>
       </w:pPr>
       <w:r>
@@ -912,7 +912,7 @@
     <w:p>
       <w:pPr>
         <w:pStyle w:val="BodyText"/>
-        <w:spacing w:before="90"/>
+        <w:spacing w:before="60"/>
         <w:ind w:left="182"/>
       </w:pPr>
       <w:r>
@@ -936,7 +936,7 @@
     <w:p>
       <w:pPr>
         <w:pStyle w:val="BodyText"/>
-        <w:spacing w:before="90"/>
+        <w:spacing w:before="60"/>
         <w:ind w:left="182"/>
       </w:pPr>
       <w:r>
@@ -960,7 +960,7 @@
     <w:p>
       <w:pPr>
         <w:pStyle w:val="BodyText"/>
-        <w:spacing w:before="90"/>
+        <w:spacing w:before="60"/>
         <w:ind w:left="182"/>
       </w:pPr>
       <w:r>
@@ -1001,7 +1001,7 @@
                 <wp:positionV relativeFrom="paragraph">
                   <wp:posOffset>200660</wp:posOffset>
                 </wp:positionV>
-                <wp:extent cx="6171565" cy="1270"/>
+                <wp:extent cx="6286500" cy="1270"/>
                 <wp:effectExtent l="0" t="5080" r="0" b="3810"/>
                 <wp:wrapTopAndBottom/>
                 <wp:docPr id="4" name="Graphic 6"/>
@@ -1013,7 +1013,7 @@
                       <wps:spPr>
                         <a:xfrm>
                           <a:off x="0" y="0"/>
-                          <a:ext cx="6171480" cy="1440"/>
+                          <a:ext cx="6286500" cy="1440"/>
                         </a:xfrm>
                         <a:custGeom>
                           <a:avLst/>
@@ -1169,7 +1169,7 @@
                 <wp:positionV relativeFrom="paragraph">
                   <wp:posOffset>200660</wp:posOffset>
                 </wp:positionV>
-                <wp:extent cx="6171565" cy="1270"/>
+                <wp:extent cx="6286500" cy="1270"/>
                 <wp:effectExtent l="0" t="5080" r="0" b="3810"/>
                 <wp:wrapTopAndBottom/>
                 <wp:docPr id="5" name="Graphic 2"/>
@@ -1181,7 +1181,7 @@
                       <wps:spPr>
                         <a:xfrm>
                           <a:off x="0" y="0"/>
-                          <a:ext cx="6171480" cy="1440"/>
+                          <a:ext cx="6286500" cy="1440"/>
                         </a:xfrm>
                         <a:custGeom>
                           <a:avLst/>

</xml_diff>

<commit_message>
Say final-year student, not graduate; capstone defense remaining
</commit_message>
<xml_diff>
--- a/assets/Sean_Lennard_Orias_CV.docx
+++ b/assets/Sean_Lennard_Orias_CV.docx
@@ -172,7 +172,7 @@
       </w:pPr>
       <w:r>
         <w:rPr/>
-        <w:t xml:space="preserve">IT graduate with internship experience troubleshooting email delivery, webmail access and hosting issues, migrating a client’s website and business email, and writing 60+ help-center and KB articles. Built a Windows Server 2025 / Active Directory homelab covering user management, Group Policy and help desk tickets.</w:t>
+        <w:t xml:space="preserve">Final-year IT student with internship experience troubleshooting email delivery, webmail access and hosting issues, migrating a client’s website and business email, and writing 60+ help-center and KB articles. Built a Windows Server 2025 / Active Directory homelab covering user management, Group Policy and help desk tickets.</w:t>
       </w:r>
     </w:p>
     <w:p>
@@ -1272,7 +1272,7 @@
         <w:t>Bachelor of Science in Information Technology</w:t>
       </w:r>
       <w:r>
-        <w:t xml:space="preserve"> - 2026</w:t>
+        <w:t xml:space="preserve"> – Expected 2026 (coursework complete; capstone defense remaining)</w:t>
       </w:r>
     </w:p>
     <w:sectPr>

</xml_diff>

<commit_message>
Back to IT graduate; expand disaster preparedness game on CV and portfolio
</commit_message>
<xml_diff>
--- a/assets/Sean_Lennard_Orias_CV.docx
+++ b/assets/Sean_Lennard_Orias_CV.docx
@@ -172,7 +172,7 @@
       </w:pPr>
       <w:r>
         <w:rPr/>
-        <w:t xml:space="preserve">Final-year IT student with internship experience troubleshooting email delivery, webmail access and hosting issues, migrating a client’s website and business email, and writing 60+ help-center and KB articles. Built a Windows Server 2025 / Active Directory homelab covering user management, Group Policy and help desk tickets.</w:t>
+        <w:t xml:space="preserve">IT graduate with internship experience troubleshooting email delivery, webmail access and hosting issues, migrating a client’s website and business email, and writing 60+ help-center and KB articles. Built a Windows Server 2025 / Active Directory homelab covering user management, Group Policy and help desk tickets.</w:t>
       </w:r>
     </w:p>
     <w:p>
@@ -326,7 +326,7 @@
         <w:tabs>
           <w:tab w:val="left" w:pos="662"/>
         </w:tabs>
-        <w:spacing w:before="60"/>
+        <w:spacing w:before="15"/>
         <w:ind w:right="213"/>
         <w:jc w:val="left"/>
         <w:rPr>
@@ -350,7 +350,7 @@
         <w:tabs>
           <w:tab w:val="left" w:pos="662"/>
         </w:tabs>
-        <w:spacing w:before="60"/>
+        <w:spacing w:before="15"/>
         <w:ind w:right="213"/>
         <w:jc w:val="left"/>
         <w:rPr>
@@ -376,7 +376,7 @@
         <w:tabs>
           <w:tab w:val="left" w:pos="662"/>
         </w:tabs>
-        <w:spacing w:before="60"/>
+        <w:spacing w:before="15"/>
         <w:ind w:right="213"/>
         <w:jc w:val="left"/>
         <w:rPr>
@@ -400,7 +400,7 @@
         <w:tabs>
           <w:tab w:val="left" w:pos="662"/>
         </w:tabs>
-        <w:spacing w:before="60"/>
+        <w:spacing w:before="15"/>
         <w:ind w:right="213"/>
         <w:jc w:val="left"/>
         <w:rPr>
@@ -424,7 +424,7 @@
         <w:tabs>
           <w:tab w:val="left" w:pos="662"/>
         </w:tabs>
-        <w:spacing w:before="60"/>
+        <w:spacing w:before="15"/>
         <w:ind w:right="213"/>
         <w:jc w:val="left"/>
         <w:rPr>
@@ -612,7 +612,7 @@
         <w:tabs>
           <w:tab w:val="left" w:pos="662"/>
         </w:tabs>
-        <w:spacing w:before="60"/>
+        <w:spacing w:before="15"/>
         <w:ind w:right="213"/>
         <w:jc w:val="left"/>
         <w:rPr>
@@ -636,7 +636,7 @@
         <w:tabs>
           <w:tab w:val="left" w:pos="662"/>
         </w:tabs>
-        <w:spacing w:before="60"/>
+        <w:spacing w:before="15"/>
         <w:ind w:right="213"/>
         <w:jc w:val="left"/>
         <w:rPr>
@@ -660,7 +660,7 @@
         <w:tabs>
           <w:tab w:val="left" w:pos="662"/>
         </w:tabs>
-        <w:spacing w:before="60"/>
+        <w:spacing w:before="15"/>
         <w:ind w:right="213"/>
         <w:jc w:val="left"/>
         <w:rPr>
@@ -684,7 +684,7 @@
         <w:tabs>
           <w:tab w:val="left" w:pos="662"/>
         </w:tabs>
-        <w:spacing w:before="60"/>
+        <w:spacing w:before="15"/>
         <w:ind w:right="213"/>
         <w:jc w:val="left"/>
         <w:rPr>
@@ -742,7 +742,7 @@
         <w:tabs>
           <w:tab w:val="left" w:pos="662"/>
         </w:tabs>
-        <w:spacing w:before="60"/>
+        <w:spacing w:before="15"/>
         <w:ind w:right="213"/>
         <w:jc w:val="left"/>
         <w:rPr>
@@ -753,7 +753,31 @@
         <w:rPr>
           <w:sz w:val="20"/>
         </w:rPr>
-        <w:t>Programmed an educational game about disaster readiness in Unity (C#), including the game rules, player controls and an in-game mini-map.</w:t>
+        <w:t>Built a 3D first-person Android game in Unity (C#) set on the LPU – Cavite campus: earthquake and typhoon drills in 4 buildings, touch controls, a mini-map and route guide, safety guides and collectible items.</w:t>
+      </w:r>
+    </w:p>
+    <w:p>
+      <w:pPr>
+        <w:pStyle w:val="ListParagraph"/>
+        <w:numPr>
+          <w:ilvl w:val="0"/>
+          <w:numId w:val="1"/>
+        </w:numPr>
+        <w:tabs>
+          <w:tab w:val="left" w:pos="662"/>
+        </w:tabs>
+        <w:spacing w:before="15"/>
+        <w:ind w:right="213"/>
+        <w:jc w:val="left"/>
+        <w:rPr>
+          <w:sz w:val="20"/>
+        </w:rPr>
+      </w:pPr>
+      <w:r>
+        <w:rPr>
+          <w:sz w:val="20"/>
+        </w:rPr>
+        <w:t>Added school-email login with one-time codes, cloud saves with offline play (Supabase, PostgreSQL), and a Windows content manager that publishes level updates without a new app release.</w:t>
       </w:r>
     </w:p>
     <w:p>
@@ -1272,7 +1296,7 @@
         <w:t>Bachelor of Science in Information Technology</w:t>
       </w:r>
       <w:r>
-        <w:t xml:space="preserve"> – Expected Dec 2026 (coursework complete; capstone defense remaining)</w:t>
+        <w:t xml:space="preserve"> - 2026</w:t>
       </w:r>
     </w:p>
     <w:sectPr>

</xml_diff>

<commit_message>
CV: add the AD health report as a one-line bullet under the Windows AD homelab
</commit_message>
<xml_diff>
--- a/assets/Sean_Lennard_Orias_CV.docx
+++ b/assets/Sean_Lennard_Orias_CV.docx
@@ -74,13 +74,15 @@
     <w:p>
       <w:pPr>
         <w:pStyle w:val="Heading1"/>
-        <w:rPr/>
-      </w:pPr>
-      <w:r>
+      </w:pPr>
+      <w:r>
+        <w:rPr>
+          <w:noProof/>
+        </w:rPr>
         <mc:AlternateContent>
           <mc:Choice Requires="wps">
             <w:drawing>
-              <wp:anchor distT="0" distB="0" distL="0" distR="0" simplePos="0" relativeHeight="2" behindDoc="1" locked="0" layoutInCell="0" allowOverlap="1">
+              <wp:anchor distT="0" distB="0" distL="0" distR="0" simplePos="0" relativeHeight="251655168" behindDoc="1" locked="0" layoutInCell="0" allowOverlap="1" wp14:anchorId="0940F0CE" wp14:editId="1B62C34A">
                 <wp:simplePos x="0" y="0"/>
                 <wp:positionH relativeFrom="page">
                   <wp:posOffset>800100</wp:posOffset>
@@ -92,6 +94,7 @@
                 <wp:effectExtent l="0" t="5080" r="0" b="3810"/>
                 <wp:wrapTopAndBottom/>
                 <wp:docPr id="1" name="Graphic 1"/>
+                <wp:cNvGraphicFramePr/>
                 <a:graphic xmlns:a="http://schemas.openxmlformats.org/drawingml/2006/main">
                   <a:graphicData uri="http://schemas.microsoft.com/office/word/2010/wordprocessingShape">
                     <wps:wsp>
@@ -113,7 +116,7 @@
                           <a:cxnLst/>
                           <a:rect l="textAreaLeft" t="textAreaTop" r="textAreaRight" b="textAreaBottom"/>
                           <a:pathLst>
-                            <a:path w="6171565" h="0">
+                            <a:path w="6171565">
                               <a:moveTo>
                                 <a:pt x="6171565" y="0"/>
                               </a:moveTo>
@@ -121,7 +124,7 @@
                                 <a:pt x="0" y="0"/>
                               </a:lnTo>
                             </a:path>
-                            <a:path w="6171565" h="0">
+                            <a:path w="6171565">
                               <a:moveTo>
                                 <a:pt x="6171565" y="0"/>
                               </a:moveTo>
@@ -140,9 +143,15 @@
                         </a:ln>
                       </wps:spPr>
                       <wps:style>
-                        <a:lnRef idx="0"/>
-                        <a:fillRef idx="0"/>
-                        <a:effectRef idx="0"/>
+                        <a:lnRef idx="0">
+                          <a:scrgbClr r="0" g="0" b="0"/>
+                        </a:lnRef>
+                        <a:fillRef idx="0">
+                          <a:scrgbClr r="0" g="0" b="0"/>
+                        </a:fillRef>
+                        <a:effectRef idx="0">
+                          <a:scrgbClr r="0" g="0" b="0"/>
+                        </a:effectRef>
                         <a:fontRef idx="minor"/>
                       </wps:style>
                       <wps:bodyPr/>
@@ -158,36 +167,27 @@
         </mc:AlternateContent>
       </w:r>
       <w:r>
-        <w:rPr/>
         <w:t>SUMMARY</w:t>
       </w:r>
     </w:p>
     <w:p>
       <w:pPr>
         <w:pStyle w:val="BodyText"/>
-        <w:spacing w:before="90" w:after="0"/>
-        <w:ind w:start="182" w:end="0"/>
-        <w:jc w:val="left"/>
-        <w:rPr/>
-      </w:pPr>
-      <w:r>
-        <w:rPr/>
-        <w:t xml:space="preserve">IT graduate with internship experience troubleshooting email delivery, webmail access and hosting issues, migrating a client’s website and business email, and writing 60+ help-center and KB articles. Built a Windows Server 2025 / Active Directory homelab covering user management, Group Policy and help desk tickets.</w:t>
+        <w:spacing w:before="90"/>
+        <w:ind w:left="182"/>
+      </w:pPr>
+      <w:r>
+        <w:t>IT graduate with internship experience troubleshooting email delivery, webmail access and hosting issues, migrating a client’s website and business email, and writing 60+ help-center and KB articles. Built a Windows Server 2025 / Active Directory homelab covering user management, Group Policy and help desk tickets.</w:t>
       </w:r>
     </w:p>
     <w:p>
       <w:pPr>
         <w:pStyle w:val="BodyText"/>
-        <w:spacing w:before="20" w:after="0"/>
+        <w:spacing w:before="20"/>
         <w:rPr>
           <w:sz w:val="10"/>
         </w:rPr>
       </w:pPr>
-      <w:r>
-        <w:rPr>
-          <w:sz w:val="10"/>
-        </w:rPr>
-      </w:r>
     </w:p>
     <w:p>
       <w:pPr>
@@ -200,7 +200,7 @@
         <mc:AlternateContent>
           <mc:Choice Requires="wps">
             <w:drawing>
-              <wp:anchor distT="0" distB="635" distL="0" distR="0" simplePos="0" relativeHeight="4" behindDoc="1" locked="0" layoutInCell="0" allowOverlap="1" wp14:anchorId="41B46983" wp14:editId="4140A5E6">
+              <wp:anchor distT="0" distB="635" distL="0" distR="0" simplePos="0" relativeHeight="251658240" behindDoc="1" locked="0" layoutInCell="0" allowOverlap="1" wp14:anchorId="41B46983" wp14:editId="4140A5E6">
                 <wp:simplePos x="0" y="0"/>
                 <wp:positionH relativeFrom="page">
                   <wp:posOffset>800100</wp:posOffset>
@@ -211,7 +211,7 @@
                 <wp:extent cx="6286500" cy="1270"/>
                 <wp:effectExtent l="0" t="5080" r="0" b="3810"/>
                 <wp:wrapTopAndBottom/>
-                <wp:docPr id="1" name="Graphic 4"/>
+                <wp:docPr id="324675034" name="Graphic 4"/>
                 <wp:cNvGraphicFramePr/>
                 <a:graphic xmlns:a="http://schemas.openxmlformats.org/drawingml/2006/main">
                   <a:graphicData uri="http://schemas.microsoft.com/office/word/2010/wordprocessingShape">
@@ -297,7 +297,6 @@
       <w:pPr>
         <w:spacing w:before="104"/>
         <w:ind w:left="181"/>
-        <w:jc w:val="left"/>
         <w:rPr>
           <w:sz w:val="20"/>
         </w:rPr>
@@ -307,7 +306,7 @@
           <w:b/>
           <w:sz w:val="20"/>
         </w:rPr>
-        <w:t xml:space="preserve">Server Administrator Intern</w:t>
+        <w:t>Server Administrator Intern</w:t>
       </w:r>
       <w:r>
         <w:rPr>
@@ -328,7 +327,6 @@
         </w:tabs>
         <w:spacing w:before="15"/>
         <w:ind w:right="213"/>
-        <w:jc w:val="left"/>
         <w:rPr>
           <w:sz w:val="20"/>
         </w:rPr>
@@ -352,19 +350,16 @@
         </w:tabs>
         <w:spacing w:before="15"/>
         <w:ind w:right="213"/>
-        <w:jc w:val="left"/>
-        <w:rPr>
-          <w:sz w:val="20"/>
-        </w:rPr>
-      </w:pPr>
-      <w:proofErr w:type="gramStart"/>
+        <w:rPr>
+          <w:sz w:val="20"/>
+        </w:rPr>
+      </w:pPr>
       <w:r>
         <w:rPr>
           <w:sz w:val="20"/>
         </w:rPr>
         <w:t>Troubleshot email delivery failures, a Spamhaus-listed mail server and webmail sign-in issues; provided on-site support during the server cutover.</w:t>
       </w:r>
-      <w:proofErr w:type="gramEnd"/>
     </w:p>
     <w:p>
       <w:pPr>
@@ -378,7 +373,6 @@
         </w:tabs>
         <w:spacing w:before="15"/>
         <w:ind w:right="213"/>
-        <w:jc w:val="left"/>
         <w:rPr>
           <w:sz w:val="20"/>
         </w:rPr>
@@ -402,7 +396,6 @@
         </w:tabs>
         <w:spacing w:before="15"/>
         <w:ind w:right="213"/>
-        <w:jc w:val="left"/>
         <w:rPr>
           <w:sz w:val="20"/>
         </w:rPr>
@@ -426,7 +419,6 @@
         </w:tabs>
         <w:spacing w:before="15"/>
         <w:ind w:right="213"/>
-        <w:jc w:val="left"/>
         <w:rPr>
           <w:sz w:val="20"/>
         </w:rPr>
@@ -458,7 +450,7 @@
         <mc:AlternateContent>
           <mc:Choice Requires="wps">
             <w:drawing>
-              <wp:anchor distT="0" distB="635" distL="0" distR="0" simplePos="0" relativeHeight="5" behindDoc="1" locked="0" layoutInCell="0" allowOverlap="1" wp14:anchorId="68294431" wp14:editId="1229EB43">
+              <wp:anchor distT="0" distB="635" distL="0" distR="0" simplePos="0" relativeHeight="251659264" behindDoc="1" locked="0" layoutInCell="0" allowOverlap="1" wp14:anchorId="68294431" wp14:editId="1229EB43">
                 <wp:simplePos x="0" y="0"/>
                 <wp:positionH relativeFrom="page">
                   <wp:posOffset>800100</wp:posOffset>
@@ -568,17 +560,8 @@
           <w:b/>
           <w:sz w:val="20"/>
         </w:rPr>
-        <w:t xml:space="preserve">Windows Active Directory </w:t>
-      </w:r>
-      <w:proofErr w:type="spellStart"/>
-      <w:r>
-        <w:rPr>
-          <w:b/>
-          <w:sz w:val="20"/>
-        </w:rPr>
-        <w:t>Homelab</w:t>
-      </w:r>
-      <w:proofErr w:type="spellEnd"/>
+        <w:t>Windows Active Directory Homelab</w:t>
+      </w:r>
       <w:r>
         <w:rPr>
           <w:b/>
@@ -614,7 +597,6 @@
         </w:tabs>
         <w:spacing w:before="15"/>
         <w:ind w:right="213"/>
-        <w:jc w:val="left"/>
         <w:rPr>
           <w:sz w:val="20"/>
         </w:rPr>
@@ -638,7 +620,6 @@
         </w:tabs>
         <w:spacing w:before="15"/>
         <w:ind w:right="213"/>
-        <w:jc w:val="left"/>
         <w:rPr>
           <w:sz w:val="20"/>
         </w:rPr>
@@ -662,7 +643,6 @@
         </w:tabs>
         <w:spacing w:before="15"/>
         <w:ind w:right="213"/>
-        <w:jc w:val="left"/>
         <w:rPr>
           <w:sz w:val="20"/>
         </w:rPr>
@@ -686,7 +666,6 @@
         </w:tabs>
         <w:spacing w:before="15"/>
         <w:ind w:right="213"/>
-        <w:jc w:val="left"/>
         <w:rPr>
           <w:sz w:val="20"/>
         </w:rPr>
@@ -696,40 +675,6 @@
           <w:sz w:val="20"/>
         </w:rPr>
         <w:t>Found and fixed a security gap that let the help desk account reset an administrator’s password.</w:t>
-      </w:r>
-    </w:p>
-    <w:p>
-      <w:pPr>
-        <w:tabs>
-          <w:tab w:val="left" w:pos="3900"/>
-        </w:tabs>
-        <w:spacing w:before="90"/>
-        <w:ind w:left="182"/>
-        <w:rPr>
-          <w:i/>
-          <w:sz w:val="20"/>
-        </w:rPr>
-      </w:pPr>
-      <w:r>
-        <w:rPr>
-          <w:b/>
-          <w:sz w:val="20"/>
-        </w:rPr>
-        <w:t>Disaster Preparedness Game</w:t>
-      </w:r>
-      <w:r>
-        <w:rPr>
-          <w:b/>
-          <w:sz w:val="20"/>
-        </w:rPr>
-        <w:tab/>
-      </w:r>
-      <w:r>
-        <w:rPr>
-          <w:i/>
-          <w:sz w:val="20"/>
-        </w:rPr>
-        <w:t>Team Capstone Project — Programmer</w:t>
       </w:r>
     </w:p>
     <w:p>
@@ -744,16 +689,49 @@
         </w:tabs>
         <w:spacing w:before="15"/>
         <w:ind w:right="213"/>
-        <w:jc w:val="left"/>
-        <w:rPr>
-          <w:sz w:val="20"/>
-        </w:rPr>
-      </w:pPr>
-      <w:r>
-        <w:rPr>
-          <w:sz w:val="20"/>
-        </w:rPr>
-        <w:t>Built a 3D first-person Android game in Unity (C#) set on the LPU – Cavite campus: earthquake and typhoon drills in 4 buildings, touch controls, a mini-map and route guide, safety guides and collectible items.</w:t>
+        <w:rPr>
+          <w:sz w:val="20"/>
+        </w:rPr>
+      </w:pPr>
+      <w:r>
+        <w:rPr>
+          <w:sz w:val="20"/>
+        </w:rPr>
+        <w:t>Wrote a PowerShell AD health report that flags locked-out, expired and stale accounts and unlinked GPOs.</w:t>
+      </w:r>
+    </w:p>
+    <w:p>
+      <w:pPr>
+        <w:tabs>
+          <w:tab w:val="left" w:pos="3900"/>
+        </w:tabs>
+        <w:spacing w:before="90"/>
+        <w:ind w:left="182"/>
+        <w:rPr>
+          <w:i/>
+          <w:sz w:val="20"/>
+        </w:rPr>
+      </w:pPr>
+      <w:r>
+        <w:rPr>
+          <w:b/>
+          <w:sz w:val="20"/>
+        </w:rPr>
+        <w:t>Disaster Preparedness Game</w:t>
+      </w:r>
+      <w:r>
+        <w:rPr>
+          <w:b/>
+          <w:sz w:val="20"/>
+        </w:rPr>
+        <w:tab/>
+      </w:r>
+      <w:r>
+        <w:rPr>
+          <w:i/>
+          <w:sz w:val="20"/>
+        </w:rPr>
+        <w:t>Team Capstone Project — Programmer</w:t>
       </w:r>
     </w:p>
     <w:p>
@@ -768,7 +746,29 @@
         </w:tabs>
         <w:spacing w:before="15"/>
         <w:ind w:right="213"/>
-        <w:jc w:val="left"/>
+        <w:rPr>
+          <w:sz w:val="20"/>
+        </w:rPr>
+      </w:pPr>
+      <w:r>
+        <w:rPr>
+          <w:sz w:val="20"/>
+        </w:rPr>
+        <w:t>Built a 3D first-person Android game in Unity (C#) set on the LPU – Cavite campus: earthquake and typhoon drills in 4 buildings, touch controls, a mini-map and route guide, safety guides and collectible items.</w:t>
+      </w:r>
+    </w:p>
+    <w:p>
+      <w:pPr>
+        <w:pStyle w:val="ListParagraph"/>
+        <w:numPr>
+          <w:ilvl w:val="0"/>
+          <w:numId w:val="1"/>
+        </w:numPr>
+        <w:tabs>
+          <w:tab w:val="left" w:pos="662"/>
+        </w:tabs>
+        <w:spacing w:before="15"/>
+        <w:ind w:right="213"/>
         <w:rPr>
           <w:sz w:val="20"/>
         </w:rPr>
@@ -800,7 +800,7 @@
         <mc:AlternateContent>
           <mc:Choice Requires="wps">
             <w:drawing>
-              <wp:anchor distT="0" distB="635" distL="0" distR="0" simplePos="0" relativeHeight="3" behindDoc="1" locked="0" layoutInCell="0" allowOverlap="1" wp14:anchorId="6D332C8C" wp14:editId="5F40F470">
+              <wp:anchor distT="0" distB="635" distL="0" distR="0" simplePos="0" relativeHeight="251657216" behindDoc="1" locked="0" layoutInCell="0" allowOverlap="1" wp14:anchorId="6D332C8C" wp14:editId="5F40F470">
                 <wp:simplePos x="0" y="0"/>
                 <wp:positionH relativeFrom="page">
                   <wp:posOffset>800100</wp:posOffset>
@@ -912,7 +912,6 @@
     <w:p>
       <w:pPr>
         <w:pStyle w:val="BodyText"/>
-        <w:spacing w:before="60"/>
         <w:ind w:left="182"/>
       </w:pPr>
       <w:r>
@@ -922,21 +921,12 @@
         <w:t xml:space="preserve">Web Hosting &amp; Servers: </w:t>
       </w:r>
       <w:r>
-        <w:t xml:space="preserve">cPanel, WHM, </w:t>
-      </w:r>
-      <w:proofErr w:type="spellStart"/>
-      <w:r>
-        <w:t>CyberPanel</w:t>
-      </w:r>
-      <w:proofErr w:type="spellEnd"/>
-      <w:r>
-        <w:t>, Hostinger, Linux command line, backups, scheduled tasks, monitoring</w:t>
+        <w:t>cPanel, WHM, CyberPanel, Hostinger, Linux command line, backups, scheduled tasks, monitoring</w:t>
       </w:r>
     </w:p>
     <w:p>
       <w:pPr>
         <w:pStyle w:val="BodyText"/>
-        <w:spacing w:before="60"/>
         <w:ind w:left="182"/>
       </w:pPr>
       <w:r>
@@ -946,21 +936,12 @@
         <w:t xml:space="preserve">Domains &amp; DNS: </w:t>
       </w:r>
       <w:r>
-        <w:t xml:space="preserve">Cloudflare, </w:t>
-      </w:r>
-      <w:proofErr w:type="spellStart"/>
-      <w:r>
-        <w:t>Domainmod</w:t>
-      </w:r>
-      <w:proofErr w:type="spellEnd"/>
-      <w:r>
-        <w:t>, DNS records, moving live domains between servers</w:t>
+        <w:t>Cloudflare, Domainmod, DNS records, moving live domains between servers</w:t>
       </w:r>
     </w:p>
     <w:p>
       <w:pPr>
         <w:pStyle w:val="BodyText"/>
-        <w:spacing w:before="60"/>
         <w:ind w:left="182"/>
       </w:pPr>
       <w:r>
@@ -970,21 +951,12 @@
         <w:t xml:space="preserve">IT Support: </w:t>
       </w:r>
       <w:r>
-        <w:t xml:space="preserve">Email delivery problems, spam blocklists, webmail access, </w:t>
-      </w:r>
-      <w:proofErr w:type="spellStart"/>
-      <w:r>
-        <w:t>BeDesk</w:t>
-      </w:r>
-      <w:proofErr w:type="spellEnd"/>
-      <w:r>
-        <w:t xml:space="preserve"> ticketing, Microsoft 365, Google Workspace</w:t>
+        <w:t>Email delivery problems, spam blocklists, webmail access, BeDesk ticketing, Microsoft 365, Google Workspace</w:t>
       </w:r>
     </w:p>
     <w:p>
       <w:pPr>
         <w:pStyle w:val="BodyText"/>
-        <w:spacing w:before="60"/>
         <w:ind w:left="182"/>
       </w:pPr>
       <w:r>
@@ -1017,7 +989,7 @@
         <mc:AlternateContent>
           <mc:Choice Requires="wps">
             <w:drawing>
-              <wp:anchor distT="0" distB="635" distL="0" distR="0" simplePos="0" relativeHeight="6" behindDoc="1" locked="0" layoutInCell="0" allowOverlap="1" wp14:anchorId="59EE5702" wp14:editId="278CDE44">
+              <wp:anchor distT="0" distB="635" distL="0" distR="0" simplePos="0" relativeHeight="251660288" behindDoc="1" locked="0" layoutInCell="0" allowOverlap="1" wp14:anchorId="59EE5702" wp14:editId="278CDE44">
                 <wp:simplePos x="0" y="0"/>
                 <wp:positionH relativeFrom="page">
                   <wp:posOffset>800100</wp:posOffset>
@@ -1115,10 +1087,9 @@
         <w:pStyle w:val="BodyText"/>
         <w:spacing w:before="90"/>
         <w:ind w:left="182"/>
-        <w:jc w:val="left"/>
-      </w:pPr>
-      <w:r>
-        <w:t xml:space="preserve">Certified Cloud System Analyst [CCSA] (2026)</w:t>
+      </w:pPr>
+      <w:r>
+        <w:t>Certified Cloud System Analyst [CCSA] (2026)</w:t>
       </w:r>
     </w:p>
     <w:p>
@@ -1126,10 +1097,9 @@
         <w:pStyle w:val="BodyText"/>
         <w:spacing w:before="20"/>
         <w:ind w:left="182"/>
-        <w:jc w:val="left"/>
-      </w:pPr>
-      <w:r>
-        <w:t xml:space="preserve">Google AI Essentials, Coursera (2026)</w:t>
+      </w:pPr>
+      <w:r>
+        <w:t>Google AI Essentials, Coursera (2026)</w:t>
       </w:r>
     </w:p>
     <w:p>
@@ -1137,10 +1107,9 @@
         <w:pStyle w:val="BodyText"/>
         <w:spacing w:before="20"/>
         <w:ind w:left="182"/>
-        <w:jc w:val="left"/>
-      </w:pPr>
-      <w:r>
-        <w:t xml:space="preserve">Google Cybersecurity Certificate, Coursera (2026)</w:t>
+      </w:pPr>
+      <w:r>
+        <w:t>Google Cybersecurity Certificate, Coursera (2026)</w:t>
       </w:r>
     </w:p>
     <w:p>
@@ -1148,10 +1117,9 @@
         <w:pStyle w:val="BodyText"/>
         <w:spacing w:before="20"/>
         <w:ind w:left="182"/>
-        <w:jc w:val="left"/>
-      </w:pPr>
-      <w:r>
-        <w:t xml:space="preserve">IT Specialist – Databases, Certiport (2024)</w:t>
+      </w:pPr>
+      <w:r>
+        <w:t>IT Specialist – Databases, Certiport (2024)</w:t>
       </w:r>
     </w:p>
     <w:p>
@@ -1159,10 +1127,9 @@
         <w:pStyle w:val="BodyText"/>
         <w:spacing w:before="20"/>
         <w:ind w:left="182"/>
-        <w:jc w:val="left"/>
-      </w:pPr>
-      <w:r>
-        <w:t xml:space="preserve">SAP Business One, SAP (2023)</w:t>
+      </w:pPr>
+      <w:r>
+        <w:t>SAP Business One, SAP (2023)</w:t>
       </w:r>
     </w:p>
     <w:p>
@@ -1185,7 +1152,7 @@
         <mc:AlternateContent>
           <mc:Choice Requires="wps">
             <w:drawing>
-              <wp:anchor distT="0" distB="635" distL="0" distR="0" simplePos="0" relativeHeight="2" behindDoc="1" locked="0" layoutInCell="0" allowOverlap="1" wp14:anchorId="623797D0" wp14:editId="09C800D9">
+              <wp:anchor distT="0" distB="635" distL="0" distR="0" simplePos="0" relativeHeight="251656192" behindDoc="1" locked="0" layoutInCell="0" allowOverlap="1" wp14:anchorId="623797D0" wp14:editId="09C800D9">
                 <wp:simplePos x="0" y="0"/>
                 <wp:positionH relativeFrom="page">
                   <wp:posOffset>800100</wp:posOffset>
@@ -1301,10 +1268,10 @@
     </w:p>
     <w:sectPr>
       <w:pgSz w:w="12240" w:h="15840"/>
-      <w:pgMar w:top="900" w:right="1080" w:bottom="280" w:left="1080" w:header="0" w:footer="0" w:gutter="0"/>
+      <w:pgMar w:top="760" w:right="1080" w:bottom="280" w:left="1080" w:header="0" w:footer="0" w:gutter="0"/>
       <w:cols w:space="720"/>
       <w:formProt w:val="0"/>
-      <w:docGrid w:linePitch="100"/>
+      <w:docGrid w:linePitch="299"/>
     </w:sectPr>
   </w:body>
 </w:document>

</xml_diff>

<commit_message>
Target systems administration, support and entry-level cloud roles
Title, hero, meta, Open to and contact text now include cloud roles; new
AWS and infrastructure as code skills group. CV adds the AWS homelab and
a Cloud skills line, with the capstone trimmed to one line; still 1 page.
</commit_message>
<xml_diff>
--- a/assets/Sean_Lennard_Orias_CV.docx
+++ b/assets/Sean_Lennard_Orias_CV.docx
@@ -177,7 +177,7 @@
         <w:ind w:left="182"/>
       </w:pPr>
       <w:r>
-        <w:t>IT graduate with internship experience troubleshooting email delivery, webmail access and hosting issues, migrating a client’s website and business email, and writing 60+ help-center and KB articles. Built a Windows Server 2025 / Active Directory homelab covering user management, Group Policy and help desk tickets.</w:t>
+        <w:t xml:space="preserve">IT graduate with internship experience troubleshooting email delivery, webmail access and hosting issues, migrating a client’s website and business email, and writing 60+ help-center and KB articles. Built AD and AWS homelabs.</w:t>
       </w:r>
     </w:p>
     <w:p>
@@ -651,7 +651,7 @@
         <w:rPr>
           <w:sz w:val="20"/>
         </w:rPr>
-        <w:t>Worked through 6 help desk tickets (locked accounts, password resets, new starters, leavers) and wrote PowerShell scripts that automate setting up and removing user accounts.</w:t>
+        <w:t xml:space="preserve">Worked through 6 help desk tickets (locked accounts, password resets, new starters, leavers), wrote PowerShell scripts for account setup and removal, and closed a gap that let the help desk reset an admin’s password.</w:t>
       </w:r>
     </w:p>
     <w:p>
@@ -674,8 +674,50 @@
         <w:rPr>
           <w:sz w:val="20"/>
         </w:rPr>
-        <w:t>Found and fixed a security gap that let the help desk account reset an administrator’s password.</w:t>
-      </w:r>
+        <w:t>Wrote a PowerShell AD health report that flags locked-out, expired and stale accounts and unlinked GPOs.</w:t>
+      </w:r>
+    </w:p>
+    <w:p>
+      <w:pPr>
+        <w:tabs>
+          <w:tab w:val="left" w:pos="3900"/>
+        </w:tabs>
+        <w:spacing w:before="90"/>
+        <w:ind w:left="182"/>
+        <w:rPr>
+          <w:i/>
+          <w:sz w:val="20"/>
+        </w:rPr>
+      </w:pPr>
+      <w:r>
+        <w:rPr>
+          <w:b/>
+          <w:sz w:val="20"/>
+        </w:rPr>
+        <w:t>AWS Cloud Homelab</w:t>
+      </w:r>
+      <w:r>
+        <w:rPr>
+          <w:b/>
+          <w:sz w:val="20"/>
+        </w:rPr>
+        <w:tab/>
+      </w:r>
+      <w:r>
+        <w:rPr>
+          <w:i/>
+          <w:sz w:val="20"/>
+        </w:rPr>
+        <w:t xml:space="preserve">Personal Project — </w:t>
+      </w:r>
+      <w:hyperlink r:id="rId12">
+        <w:r>
+          <w:rPr>
+            <w:rStyle w:val="Hyperlink"/>
+          </w:rPr>
+          <w:t>Source on GitHub</w:t>
+        </w:r>
+      </w:hyperlink>
     </w:p>
     <w:p>
       <w:pPr>
@@ -697,41 +739,7 @@
         <w:rPr>
           <w:sz w:val="20"/>
         </w:rPr>
-        <w:t>Wrote a PowerShell AD health report that flags locked-out, expired and stale accounts and unlinked GPOs.</w:t>
-      </w:r>
-    </w:p>
-    <w:p>
-      <w:pPr>
-        <w:tabs>
-          <w:tab w:val="left" w:pos="3900"/>
-        </w:tabs>
-        <w:spacing w:before="90"/>
-        <w:ind w:left="182"/>
-        <w:rPr>
-          <w:i/>
-          <w:sz w:val="20"/>
-        </w:rPr>
-      </w:pPr>
-      <w:r>
-        <w:rPr>
-          <w:b/>
-          <w:sz w:val="20"/>
-        </w:rPr>
-        <w:t>Disaster Preparedness Game</w:t>
-      </w:r>
-      <w:r>
-        <w:rPr>
-          <w:b/>
-          <w:sz w:val="20"/>
-        </w:rPr>
-        <w:tab/>
-      </w:r>
-      <w:r>
-        <w:rPr>
-          <w:i/>
-          <w:sz w:val="20"/>
-        </w:rPr>
-        <w:t>Team Capstone Project — Programmer</w:t>
+        <w:t xml:space="preserve">Built a client portal on AWS with Terraform: a VPC across 2 Availability Zones, self-healing web servers behind a load balancer, a private RDS PostgreSQL database, S3 backups and CloudWatch alarms.</w:t>
       </w:r>
     </w:p>
     <w:p>
@@ -754,7 +762,41 @@
         <w:rPr>
           <w:sz w:val="20"/>
         </w:rPr>
-        <w:t>Built a 3D first-person Android game in Unity (C#) set on the LPU – Cavite campus: earthquake and typhoon drills in 4 buildings, touch controls, a mini-map and route guide, safety guides and collectible items.</w:t>
+        <w:t xml:space="preserve">Fixed AWS guardrail issues: rerouted blocked budget alerts via SNS and traced a false deny to an SCP.</w:t>
+      </w:r>
+    </w:p>
+    <w:p>
+      <w:pPr>
+        <w:tabs>
+          <w:tab w:val="left" w:pos="3900"/>
+        </w:tabs>
+        <w:spacing w:before="90"/>
+        <w:ind w:left="182"/>
+        <w:rPr>
+          <w:i/>
+          <w:sz w:val="20"/>
+        </w:rPr>
+      </w:pPr>
+      <w:r>
+        <w:rPr>
+          <w:b/>
+          <w:sz w:val="20"/>
+        </w:rPr>
+        <w:t>Disaster Preparedness Game</w:t>
+      </w:r>
+      <w:r>
+        <w:rPr>
+          <w:b/>
+          <w:sz w:val="20"/>
+        </w:rPr>
+        <w:tab/>
+      </w:r>
+      <w:r>
+        <w:rPr>
+          <w:i/>
+          <w:sz w:val="20"/>
+        </w:rPr>
+        <w:t>Team Capstone Project — Programmer</w:t>
       </w:r>
     </w:p>
     <w:p>
@@ -777,7 +819,7 @@
         <w:rPr>
           <w:sz w:val="20"/>
         </w:rPr>
-        <w:t>Added school-email login with one-time codes, cloud saves with offline play (Supabase, PostgreSQL), and a Windows content manager that publishes level updates without a new app release.</w:t>
+        <w:t xml:space="preserve">Built a 3D Android disaster-drill game in Unity (C#) with Supabase cloud saves; published on Google Play.</w:t>
       </w:r>
     </w:p>
     <w:p>
@@ -906,7 +948,23 @@
         <w:t xml:space="preserve">Windows &amp; Active Directory: </w:t>
       </w:r>
       <w:r>
-        <w:t>Windows Server 2025, Windows 11, Active Directory users and groups, Group Policy, DNS, DHCP, folder permissions</w:t>
+        <w:t>Windows Server 2025, Windows 11, Active Directory, Group Policy, DNS, DHCP</w:t>
+      </w:r>
+    </w:p>
+    <w:p>
+      <w:pPr>
+        <w:pStyle w:val="BodyText"/>
+        <w:spacing w:before="90"/>
+        <w:ind w:left="182"/>
+      </w:pPr>
+      <w:r>
+        <w:rPr>
+          <w:b/>
+        </w:rPr>
+        <w:t xml:space="preserve">Cloud: </w:t>
+      </w:r>
+      <w:r>
+        <w:t>AWS (EC2, VPC, IAM, RDS, S3, CloudWatch), Terraform, Docker, Python (boto3)</w:t>
       </w:r>
     </w:p>
     <w:p>

</xml_diff>

<commit_message>
CV: use sean@seanorias.com and seanorias.com in the contact lines
</commit_message>
<xml_diff>
--- a/assets/Sean_Lennard_Orias_CV.docx
+++ b/assets/Sean_Lennard_Orias_CV.docx
@@ -22,7 +22,7 @@
       </w:pPr>
       <w:hyperlink r:id="rId5">
         <w:r>
-          <w:t>seanoriasx@gmail.com</w:t>
+          <w:t>sean@seanorias.com</w:t>
         </w:r>
       </w:hyperlink>
       <w:r>
@@ -36,7 +36,7 @@
           <w:rPr>
             <w:rStyle w:val="Hyperlink"/>
           </w:rPr>
-          <w:t>deadnme.github.io/portfolio</w:t>
+          <w:t>seanorias.com</w:t>
         </w:r>
       </w:hyperlink>
       <w:r>

</xml_diff>

<commit_message>
CV: link the capstone game to Google Play
</commit_message>
<xml_diff>
--- a/assets/Sean_Lennard_Orias_CV.docx
+++ b/assets/Sean_Lennard_Orias_CV.docx
@@ -798,6 +798,21 @@
         </w:rPr>
         <w:t>Team Capstone Project — Programmer</w:t>
       </w:r>
+      <w:r>
+        <w:rPr>
+          <w:i/>
+          <w:sz w:val="20"/>
+        </w:rPr>
+        <w:t xml:space="preserve"> — </w:t>
+      </w:r>
+      <w:hyperlink r:id="rId13">
+        <w:r>
+          <w:rPr>
+            <w:rStyle w:val="Hyperlink"/>
+          </w:rPr>
+          <w:t>Google Play</w:t>
+        </w:r>
+      </w:hyperlink>
     </w:p>
     <w:p>
       <w:pPr>

</xml_diff>